<commit_message>
docs: add public-law hard-negative audit
</commit_message>
<xml_diff>
--- a/paper/범죄와정책_투고원고_검증본.docx
+++ b/paper/범죄와정책_투고원고_검증본.docx
@@ -221,7 +221,7 @@
           <w:color w:val="000000"/>
           <w:sz w:val="19"/>
         </w:rPr>
-        <w:t>Layer 0 코드와 함께 저장된 합성 정상 한국어 10,000건을 독립 실행한 결과 차단 오탐은 0건이었지만, 이 자료는 직접적인 PII 유사패턴을 의도적으로 제외한 합성문장이므로 실제 서비스 오탐률의 상한으로 해석할 수 없다. 또한 36건은 변이 후 정답을 복원하지 못했고, 동명 표본 파일의 10,000/3,538건 충돌, 필수 코퍼스 누락, 테스트 실패, VIN 체크디지트 오류와 지연·비용 서술 불일치도 확인되었다.</w:t>
+        <w:t>Layer 0 코드와 함께 저장된 합성 정상 한국어 10,000건에서는 차단 오탐이 0건이었다. 그러나 PII 유사패턴을 의도적으로 제외한 자료였으므로, 국가법령정보센터의 공식 XML에서 개인정보 보호법·인공지능기본법·대한민국헌법의 비식별 조문 단위 1,519개를 추가 추출해 같은 코드를 적용하였다. 그 결과 29개(1.91%)가 국적 또는 부서 정보로 탐지되어 과잉차단 후보가 되었다. 이는 Layer 0의 필요성과 별개로 키워드 단독 탐지의 문맥 한계를 보여주지만, 법률문서 단일 도메인이므로 실제 서비스 오탐률로 일반화할 수 없다. 또한 36건은 변이 후 정답을 복원하지 못했고, 동명 표본 파일의 10,000/3,538건 충돌, 필수 코퍼스 누락, 테스트 실패, VIN 체크디지트 오류와 지연·비용 서술 불일치도 확인되었다.</w:t>
       </w:r>
     </w:p>
     <w:p>
@@ -358,7 +358,7 @@
           <w:color w:val="000000"/>
           <w:sz w:val="19"/>
         </w:rPr>
-        <w:t>Layer 0 produced zero blocks on a stored synthetic clean-Korean set of 10,000 documents, but that set deliberately excludes direct PII-like patterns and therefore cannot establish a real-world false-positive bound. Thirty-six payloads remained unreconstructed. The audit also identified conflicting 10,000/3,538-row files, missing required corpora, test failures, invalid VIN check digits, and latency and cost inconsistencies.</w:t>
+        <w:t>Layer 0 produced zero blocks on a stored synthetic clean-Korean set of 10,000 documents, but that set deliberately excludes direct PII-like patterns. A supplemental audit therefore extracted 1,519 non-personal provision units from the official XML versions of the Personal Information Protection Act, the AI Basic Act, and the Constitution. Layer 0 flagged 29 units (1.91%) as nationality or department information, revealing lexical overblocking that the synthetic clean set missed. This single public-law domain still cannot establish a real-world false-positive rate. Thirty-six payloads remained unreconstructed. The audit also identified conflicting 10,000/3,538-row files, missing required corpora, test failures, invalid VIN check digits, and latency and cost inconsistencies.</w:t>
       </w:r>
     </w:p>
     <w:p>
@@ -650,7 +650,7 @@
           <w:color w:val="000000"/>
           <w:sz w:val="19"/>
         </w:rPr>
-        <w:t>연구의 기여는 네 가지다. 첫째, 기존 평가기가 놓친 변이 후 보호대상 문자열을 9,964건에서 복원하는 감사용 평가기를 구현하였다. 둘째, 동일 PII 유형·원천값의 원형과 변이 사례 3,461쌍을 구성하고, 한국어·보호대상 변경 여부를 구분하여 변이 위험을 재추정하였다. 셋째, 기존 계층이 놓쳤으나 Layer 0 추가 구성이 차단한 1,354건과 그중 Layer 0의 직접 차단 1,353건을 확인하고, 합성 정상 한국어 10,000건에서의 차단 오탐을 함께 측정하였다. 넷째, 법적 범주, 범죄학적 보호자 개념, 제품 지원 문서와 실험 설정을 분리하고 정책 연구를 위한 최소 보고·재현 기준을 제안하였다.</w:t>
+        <w:t>연구의 기여는 네 가지다. 첫째, 기존 평가기가 놓친 변이 후 보호대상 문자열을 9,964건에서 복원하는 감사용 평가기를 구현하였다. 둘째, 동일 PII 유형·원천값의 원형과 변이 사례 3,461쌍을 구성하고, 한국어·보호대상 변경 여부를 구분하여 변이 위험을 재추정하였다. 셋째, 기존 계층이 놓쳤으나 Layer 0 추가 구성이 차단한 1,354건과 그중 Layer 0의 직접 차단 1,353건을 확인하고, 합성 정상문 10,000건과 공식 법령 조문 1,519개에서 과잉차단을 함께 측정하였다. 넷째, 법적 범주, 범죄학적 보호자 개념, 제품 지원 문서와 실험 설정을 분리하고 정책 연구를 위한 최소 보고·재현 기준을 제안하였다.</w:t>
       </w:r>
     </w:p>
     <w:p>
@@ -909,7 +909,7 @@
           <w:color w:val="000000"/>
           <w:sz w:val="19"/>
         </w:rPr>
-        <w:t>2026년 7월 21일 시행된 「인공지능 발전과 신뢰 기반 조성 등에 관한 기본법」에서 제31조는 생성형 AI 등의 고지·표시 의무를, 제33조는 고영향 AI 해당 여부의 사전 검토와 확인 절차를 규정한다. 위험관리, 설명 방안, 이용자 보호, 사람의 관리·감독, 문서 작성·보관 등 고영향 AI 사업자의 책무는 제34조에 있다. 제35조는 기본권 영향평가를 위해 노력하도록 정한다. 제43조의 과태료는 제31조 제1항 고지, 제36조 제1항 국내대리인, 제40조 제3항의 명령 불이행 등 열거된 사유에 적용된다.</w:t>
+        <w:t>「인공지능 발전과 신뢰 기반 조성 등에 관한 기본법」의 법률 제21311호 통합본에는 2026년 7월 21일 시행된 일부 개정 조문이 포함되어 있다. 그러나 본 연구가 인용하는 제31조·제33조·제34조·제35조·제43조의 조문별 시행일은 국가법령정보센터 공식 XML에서 모두 2026년 1월 22일로 확인된다. 제31조는 생성형 AI 등의 고지·표시 의무를, 제33조는 고영향 AI 해당 여부의 사전 검토와 확인 절차를 규정한다. 위험관리, 설명 방안, 이용자 보호, 사람의 관리·감독, 문서 작성·보관 등 고영향 AI 사업자의 책무는 제34조에 있다. 제35조는 기본권 영향평가를 위해 노력하도록 정한다. 제43조의 과태료는 제31조 제1항 고지, 제36조 제1항 국내대리인, 제40조 제3항의 명령 불이행 등 열거된 사유에 적용된다.</w:t>
       </w:r>
     </w:p>
     <w:p>
@@ -2294,7 +2294,7 @@
           <w:color w:val="000000"/>
           <w:sz w:val="19"/>
         </w:rPr>
-        <w:t xml:space="preserve">오탐에 대한 보조검사는 저장소의 </w:t>
+        <w:t xml:space="preserve">오탐에 대한 보조검사는 세 단계로 수행하였다. 첫째, 저장소의 </w:t>
       </w:r>
       <w:r>
         <w:rPr>
@@ -2310,7 +2310,87 @@
           <w:color w:val="000000"/>
           <w:sz w:val="19"/>
         </w:rPr>
-        <w:t>을 동일 Layer 0 normalizer와 detector에 직접 입력하여 수행하였다. 이 자료는 합성 정상 한국어 10,000건이며 직접적인 이름·전화번호·이메일·주소·계좌번호 등 PII 유사패턴을 생성 단계에서 제외한다. 따라서 이 결과는 코드 회귀검사에는 유용하지만 실제 서비스 오탐률의 상한이나 대표표본으로 해석하지 않는다.</w:t>
+        <w:t xml:space="preserve">을 동일 Layer 0 normalizer와 detector에 직접 입력하였다. 이 자료는 합성 정상 한국어 10,000건이며 직접적인 이름·전화번호·이메일·주소·계좌번호 등 PII 유사패턴을 생성 단계에서 제외한다. 둘째, 후속 v0.2 평가자료의 명시적 hard-negative 4건을 같은 Legacy Layer 0에 적용하였다. 셋째, 국가법령정보센터 LAW OPEN DATA의 공식 XML에서 개인정보 보호법(ID 011357), 인공지능기본법(ID 014820), 대한민국헌법(ID 001444)의 </w:t>
+      </w:r>
+      <w:r>
+        <w:rPr>
+          <w:rFonts w:ascii="Consolas" w:hAnsi="Consolas" w:eastAsia="Consolas"/>
+          <w:color w:val="000000"/>
+          <w:sz w:val="18"/>
+        </w:rPr>
+        <w:t>조문내용</w:t>
+      </w:r>
+      <w:r>
+        <w:rPr>
+          <w:rFonts w:ascii="바탕" w:hAnsi="바탕" w:eastAsia="바탕"/>
+          <w:color w:val="000000"/>
+          <w:sz w:val="19"/>
+        </w:rPr>
+        <w:t>·</w:t>
+      </w:r>
+      <w:r>
+        <w:rPr>
+          <w:rFonts w:ascii="Consolas" w:hAnsi="Consolas" w:eastAsia="Consolas"/>
+          <w:color w:val="000000"/>
+          <w:sz w:val="18"/>
+        </w:rPr>
+        <w:t>항내용</w:t>
+      </w:r>
+      <w:r>
+        <w:rPr>
+          <w:rFonts w:ascii="바탕" w:hAnsi="바탕" w:eastAsia="바탕"/>
+          <w:color w:val="000000"/>
+          <w:sz w:val="19"/>
+        </w:rPr>
+        <w:t>·</w:t>
+      </w:r>
+      <w:r>
+        <w:rPr>
+          <w:rFonts w:ascii="Consolas" w:hAnsi="Consolas" w:eastAsia="Consolas"/>
+          <w:color w:val="000000"/>
+          <w:sz w:val="18"/>
+        </w:rPr>
+        <w:t>호내용</w:t>
+      </w:r>
+      <w:r>
+        <w:rPr>
+          <w:rFonts w:ascii="바탕" w:hAnsi="바탕" w:eastAsia="바탕"/>
+          <w:color w:val="000000"/>
+          <w:sz w:val="19"/>
+        </w:rPr>
+        <w:t>·</w:t>
+      </w:r>
+      <w:r>
+        <w:rPr>
+          <w:rFonts w:ascii="Consolas" w:hAnsi="Consolas" w:eastAsia="Consolas"/>
+          <w:color w:val="000000"/>
+          <w:sz w:val="18"/>
+        </w:rPr>
+        <w:t>목내용</w:t>
+      </w:r>
+      <w:r>
+        <w:rPr>
+          <w:rFonts w:ascii="바탕" w:hAnsi="바탕" w:eastAsia="바탕"/>
+          <w:color w:val="000000"/>
+          <w:sz w:val="19"/>
+        </w:rPr>
+        <w:t xml:space="preserve">을 추출하였다. 연락처·메타데이터·별표·부칙·개정이유는 제외하고, 20자 이상 문장을 법령별 완전일치 중복 제거하여 비식별 조문 단위 1,519개를 구성하였다. </w:t>
+      </w:r>
+      <w:r>
+        <w:rPr>
+          <w:rFonts w:ascii="Consolas" w:hAnsi="Consolas" w:eastAsia="Consolas"/>
+          <w:color w:val="000000"/>
+          <w:sz w:val="18"/>
+        </w:rPr>
+        <w:t>paper/audit_public_law_hard_negatives.py</w:t>
+      </w:r>
+      <w:r>
+        <w:rPr>
+          <w:rFonts w:ascii="바탕" w:hAnsi="바탕" w:eastAsia="바탕"/>
+          <w:color w:val="000000"/>
+          <w:sz w:val="19"/>
+        </w:rPr>
+        <w:t>는 원문을 출력하지 않고 법령 XML·코드·평가자료의 SHA-256과 집계만 출력한다. 법령 조문은 실제 공개문서이지만 의료·금융·상담 트래픽을 대표하지 않으므로, 이 결과도 실서비스 오탐률로 해석하지 않는다.</w:t>
       </w:r>
     </w:p>
     <w:p>
@@ -2614,7 +2694,7 @@
           <w:color w:val="000000"/>
           <w:sz w:val="19"/>
         </w:rPr>
-        <w:t>법령은 국가법령정보센터 현행 조문을 기준으로 확인하였다. 제품 지원 범위는 AWS와 Presidio 프로젝트의 현행 공식 문서를 우선하였다. 학술문헌은 DOI와 출판사 페이지 또는 KCI 공식 레코드에서 제목·저자·연도·권호·쪽수의 실재를 대조하였다. 제품 블로그와 학술논문은 참고문헌에서 구분하였다.</w:t>
+        <w:t>법령은 국가법령정보센터 현행 조문과 LAW OPEN DATA XML을 기준으로 확인하고, 인공지능기본법은 법령 전체의 통합본 표시와 개별 조문의 시행일을 분리해 대조하였다. 제품 지원 범위는 AWS와 Presidio 프로젝트의 현행 공식 문서를 우선하였다. 학술문헌은 DOI와 출판사 페이지 또는 KCI 공식 레코드에서 제목·저자·연도·권호·쪽수의 실재를 대조하였다. 제품 블로그와 학술논문은 참고문헌에서 구분하였다.</w:t>
       </w:r>
     </w:p>
     <w:p>
@@ -5658,7 +5738,7 @@
           <w:color w:val="000000"/>
           <w:sz w:val="22"/>
         </w:rPr>
-        <w:t>5. Layer 0의 합성 정상문장 오탐</w:t>
+        <w:t>5. Layer 0의 정상문장·법령 하드 네거티브 오탐</w:t>
       </w:r>
     </w:p>
     <w:p>
@@ -5674,24 +5754,589 @@
           <w:color w:val="000000"/>
           <w:sz w:val="19"/>
         </w:rPr>
-        <w:t xml:space="preserve">동일한 Layer 0 normalizer와 detector를 저장된 합성 정상 한국어 10,000건에 실행한 결과 </w:t>
-      </w:r>
-      <w:r>
-        <w:rPr>
-          <w:rFonts w:ascii="Consolas" w:hAnsi="Consolas" w:eastAsia="Consolas"/>
-          <w:color w:val="000000"/>
-          <w:sz w:val="18"/>
-        </w:rPr>
-        <w:t>BLOCK</w:t>
-      </w:r>
-      <w:r>
-        <w:rPr>
-          <w:rFonts w:ascii="바탕" w:hAnsi="바탕" w:eastAsia="바탕"/>
-          <w:color w:val="000000"/>
-          <w:sz w:val="19"/>
-        </w:rPr>
-        <w:t xml:space="preserve"> 판정은 0건이었다. 분석 스크립트는 데이터, normalizer, detector의 SHA-256을 함께 산출하여 코드 변경에 따른 결과 이동을 추적한다.</w:t>
-      </w:r>
+        <w:t>동일한 Layer 0 normalizer와 detector를 세 자료에 실행한 결과는 다음과 같다.</w:t>
+      </w:r>
+    </w:p>
+    <w:tbl>
+      <w:tblPr>
+        <w:tblStyle w:val="TableGrid"/>
+        <w:tblW w:type="dxa" w:w="9970"/>
+        <w:jc w:val="left"/>
+        <w:tblLayout w:type="fixed"/>
+        <w:tblLook w:firstColumn="1" w:firstRow="1" w:lastColumn="0" w:lastRow="0" w:noHBand="0" w:noVBand="1" w:val="04A0"/>
+        <w:tblInd w:w="120" w:type="dxa"/>
+        <w:tblBorders>
+          <w:top w:val="single" w:sz="4" w:space="0" w:color="777777"/>
+          <w:left w:val="single" w:sz="4" w:space="0" w:color="777777"/>
+          <w:bottom w:val="single" w:sz="4" w:space="0" w:color="777777"/>
+          <w:right w:val="single" w:sz="4" w:space="0" w:color="777777"/>
+          <w:insideH w:val="single" w:sz="4" w:space="0" w:color="777777"/>
+          <w:insideV w:val="single" w:sz="4" w:space="0" w:color="777777"/>
+        </w:tblBorders>
+      </w:tblPr>
+      <w:tblGrid>
+        <w:gridCol w:w="2548"/>
+        <w:gridCol w:w="1688"/>
+        <w:gridCol w:w="1998"/>
+        <w:gridCol w:w="1688"/>
+        <w:gridCol w:w="2048"/>
+      </w:tblGrid>
+      <w:tr>
+        <w:trPr>
+          <w:tblHeader w:val="true"/>
+          <w:cantSplit/>
+        </w:trPr>
+        <w:tc>
+          <w:tcPr>
+            <w:tcW w:type="dxa" w:w="2548"/>
+            <w:vAlign w:val="center"/>
+            <w:shd w:fill="E7E7E7"/>
+            <w:tcMar>
+              <w:top w:w="70" w:type="dxa"/>
+              <w:start w:w="100" w:type="dxa"/>
+              <w:bottom w:w="70" w:type="dxa"/>
+              <w:end w:w="100" w:type="dxa"/>
+            </w:tcMar>
+          </w:tcPr>
+          <w:p>
+            <w:pPr>
+              <w:spacing w:after="0" w:line="252" w:lineRule="auto"/>
+              <w:jc w:val="center"/>
+            </w:pPr>
+            <w:r>
+              <w:rPr>
+                <w:rFonts w:ascii="맑은 고딕" w:hAnsi="맑은 고딕" w:eastAsia="맑은 고딕"/>
+                <w:b/>
+                <w:color w:val="000000"/>
+                <w:sz w:val="16"/>
+              </w:rPr>
+              <w:t>평가자료</w:t>
+            </w:r>
+          </w:p>
+        </w:tc>
+        <w:tc>
+          <w:tcPr>
+            <w:tcW w:type="dxa" w:w="1688"/>
+            <w:vAlign w:val="center"/>
+            <w:shd w:fill="E7E7E7"/>
+            <w:tcMar>
+              <w:top w:w="70" w:type="dxa"/>
+              <w:start w:w="100" w:type="dxa"/>
+              <w:bottom w:w="70" w:type="dxa"/>
+              <w:end w:w="100" w:type="dxa"/>
+            </w:tcMar>
+          </w:tcPr>
+          <w:p>
+            <w:pPr>
+              <w:spacing w:after="0" w:line="252" w:lineRule="auto"/>
+              <w:jc w:val="center"/>
+            </w:pPr>
+            <w:r>
+              <w:rPr>
+                <w:rFonts w:ascii="맑은 고딕" w:hAnsi="맑은 고딕" w:eastAsia="맑은 고딕"/>
+                <w:b/>
+                <w:color w:val="000000"/>
+                <w:sz w:val="16"/>
+              </w:rPr>
+              <w:t>문서 단위</w:t>
+            </w:r>
+          </w:p>
+        </w:tc>
+        <w:tc>
+          <w:tcPr>
+            <w:tcW w:type="dxa" w:w="1998"/>
+            <w:vAlign w:val="center"/>
+            <w:shd w:fill="E7E7E7"/>
+            <w:tcMar>
+              <w:top w:w="70" w:type="dxa"/>
+              <w:start w:w="100" w:type="dxa"/>
+              <w:bottom w:w="70" w:type="dxa"/>
+              <w:end w:w="100" w:type="dxa"/>
+            </w:tcMar>
+          </w:tcPr>
+          <w:p>
+            <w:pPr>
+              <w:spacing w:after="0" w:line="252" w:lineRule="auto"/>
+              <w:jc w:val="center"/>
+            </w:pPr>
+            <w:r>
+              <w:rPr>
+                <w:rFonts w:ascii="맑은 고딕" w:hAnsi="맑은 고딕" w:eastAsia="맑은 고딕"/>
+                <w:b/>
+                <w:color w:val="000000"/>
+                <w:sz w:val="16"/>
+              </w:rPr>
+              <w:t>탐지·차단 후보</w:t>
+            </w:r>
+          </w:p>
+        </w:tc>
+        <w:tc>
+          <w:tcPr>
+            <w:tcW w:type="dxa" w:w="1688"/>
+            <w:vAlign w:val="center"/>
+            <w:shd w:fill="E7E7E7"/>
+            <w:tcMar>
+              <w:top w:w="70" w:type="dxa"/>
+              <w:start w:w="100" w:type="dxa"/>
+              <w:bottom w:w="70" w:type="dxa"/>
+              <w:end w:w="100" w:type="dxa"/>
+            </w:tcMar>
+          </w:tcPr>
+          <w:p>
+            <w:pPr>
+              <w:spacing w:after="0" w:line="252" w:lineRule="auto"/>
+              <w:jc w:val="center"/>
+            </w:pPr>
+            <w:r>
+              <w:rPr>
+                <w:rFonts w:ascii="맑은 고딕" w:hAnsi="맑은 고딕" w:eastAsia="맑은 고딕"/>
+                <w:b/>
+                <w:color w:val="000000"/>
+                <w:sz w:val="16"/>
+              </w:rPr>
+              <w:t>문서 비율</w:t>
+            </w:r>
+          </w:p>
+        </w:tc>
+        <w:tc>
+          <w:tcPr>
+            <w:tcW w:type="dxa" w:w="2048"/>
+            <w:vAlign w:val="center"/>
+            <w:shd w:fill="E7E7E7"/>
+            <w:tcMar>
+              <w:top w:w="70" w:type="dxa"/>
+              <w:start w:w="100" w:type="dxa"/>
+              <w:bottom w:w="70" w:type="dxa"/>
+              <w:end w:w="100" w:type="dxa"/>
+            </w:tcMar>
+          </w:tcPr>
+          <w:p>
+            <w:pPr>
+              <w:spacing w:after="0" w:line="252" w:lineRule="auto"/>
+              <w:jc w:val="center"/>
+            </w:pPr>
+            <w:r>
+              <w:rPr>
+                <w:rFonts w:ascii="맑은 고딕" w:hAnsi="맑은 고딕" w:eastAsia="맑은 고딕"/>
+                <w:b/>
+                <w:color w:val="000000"/>
+                <w:sz w:val="16"/>
+              </w:rPr>
+              <w:t>주요 탐지유형</w:t>
+            </w:r>
+          </w:p>
+        </w:tc>
+      </w:tr>
+      <w:tr>
+        <w:trPr>
+          <w:cantSplit/>
+        </w:trPr>
+        <w:tc>
+          <w:tcPr>
+            <w:tcW w:type="dxa" w:w="2548"/>
+            <w:vAlign w:val="center"/>
+            <w:tcMar>
+              <w:top w:w="70" w:type="dxa"/>
+              <w:start w:w="100" w:type="dxa"/>
+              <w:bottom w:w="70" w:type="dxa"/>
+              <w:end w:w="100" w:type="dxa"/>
+            </w:tcMar>
+          </w:tcPr>
+          <w:p>
+            <w:pPr>
+              <w:spacing w:after="0" w:line="252" w:lineRule="auto"/>
+              <w:jc w:val="left"/>
+            </w:pPr>
+            <w:r>
+              <w:rPr>
+                <w:rFonts w:ascii="바탕" w:hAnsi="바탕" w:eastAsia="바탕"/>
+                <w:color w:val="000000"/>
+                <w:sz w:val="16"/>
+              </w:rPr>
+              <w:t>합성 정상 한국어</w:t>
+            </w:r>
+          </w:p>
+        </w:tc>
+        <w:tc>
+          <w:tcPr>
+            <w:tcW w:type="dxa" w:w="1688"/>
+            <w:vAlign w:val="center"/>
+            <w:tcMar>
+              <w:top w:w="70" w:type="dxa"/>
+              <w:start w:w="100" w:type="dxa"/>
+              <w:bottom w:w="70" w:type="dxa"/>
+              <w:end w:w="100" w:type="dxa"/>
+            </w:tcMar>
+          </w:tcPr>
+          <w:p>
+            <w:pPr>
+              <w:spacing w:after="0" w:line="252" w:lineRule="auto"/>
+              <w:jc w:val="center"/>
+            </w:pPr>
+            <w:r>
+              <w:rPr>
+                <w:rFonts w:ascii="바탕" w:hAnsi="바탕" w:eastAsia="바탕"/>
+                <w:color w:val="000000"/>
+                <w:sz w:val="16"/>
+              </w:rPr>
+              <w:t>10,000</w:t>
+            </w:r>
+          </w:p>
+        </w:tc>
+        <w:tc>
+          <w:tcPr>
+            <w:tcW w:type="dxa" w:w="1998"/>
+            <w:vAlign w:val="center"/>
+            <w:tcMar>
+              <w:top w:w="70" w:type="dxa"/>
+              <w:start w:w="100" w:type="dxa"/>
+              <w:bottom w:w="70" w:type="dxa"/>
+              <w:end w:w="100" w:type="dxa"/>
+            </w:tcMar>
+          </w:tcPr>
+          <w:p>
+            <w:pPr>
+              <w:spacing w:after="0" w:line="252" w:lineRule="auto"/>
+              <w:jc w:val="center"/>
+            </w:pPr>
+            <w:r>
+              <w:rPr>
+                <w:rFonts w:ascii="바탕" w:hAnsi="바탕" w:eastAsia="바탕"/>
+                <w:color w:val="000000"/>
+                <w:sz w:val="16"/>
+              </w:rPr>
+              <w:t>0</w:t>
+            </w:r>
+          </w:p>
+        </w:tc>
+        <w:tc>
+          <w:tcPr>
+            <w:tcW w:type="dxa" w:w="1688"/>
+            <w:vAlign w:val="center"/>
+            <w:tcMar>
+              <w:top w:w="70" w:type="dxa"/>
+              <w:start w:w="100" w:type="dxa"/>
+              <w:bottom w:w="70" w:type="dxa"/>
+              <w:end w:w="100" w:type="dxa"/>
+            </w:tcMar>
+          </w:tcPr>
+          <w:p>
+            <w:pPr>
+              <w:spacing w:after="0" w:line="252" w:lineRule="auto"/>
+              <w:jc w:val="center"/>
+            </w:pPr>
+            <w:r>
+              <w:rPr>
+                <w:rFonts w:ascii="바탕" w:hAnsi="바탕" w:eastAsia="바탕"/>
+                <w:color w:val="000000"/>
+                <w:sz w:val="16"/>
+              </w:rPr>
+              <w:t>0.00%</w:t>
+            </w:r>
+          </w:p>
+        </w:tc>
+        <w:tc>
+          <w:tcPr>
+            <w:tcW w:type="dxa" w:w="2048"/>
+            <w:vAlign w:val="center"/>
+            <w:tcMar>
+              <w:top w:w="70" w:type="dxa"/>
+              <w:start w:w="100" w:type="dxa"/>
+              <w:bottom w:w="70" w:type="dxa"/>
+              <w:end w:w="100" w:type="dxa"/>
+            </w:tcMar>
+          </w:tcPr>
+          <w:p>
+            <w:pPr>
+              <w:spacing w:after="0" w:line="252" w:lineRule="auto"/>
+              <w:jc w:val="center"/>
+            </w:pPr>
+            <w:r>
+              <w:rPr>
+                <w:rFonts w:ascii="바탕" w:hAnsi="바탕" w:eastAsia="바탕"/>
+                <w:color w:val="000000"/>
+                <w:sz w:val="16"/>
+              </w:rPr>
+              <w:t>없음</w:t>
+            </w:r>
+          </w:p>
+        </w:tc>
+      </w:tr>
+      <w:tr>
+        <w:trPr>
+          <w:cantSplit/>
+        </w:trPr>
+        <w:tc>
+          <w:tcPr>
+            <w:tcW w:type="dxa" w:w="2548"/>
+            <w:vAlign w:val="center"/>
+            <w:tcMar>
+              <w:top w:w="70" w:type="dxa"/>
+              <w:start w:w="100" w:type="dxa"/>
+              <w:bottom w:w="70" w:type="dxa"/>
+              <w:end w:w="100" w:type="dxa"/>
+            </w:tcMar>
+          </w:tcPr>
+          <w:p>
+            <w:pPr>
+              <w:spacing w:after="0" w:line="252" w:lineRule="auto"/>
+              <w:jc w:val="left"/>
+            </w:pPr>
+            <w:r>
+              <w:rPr>
+                <w:rFonts w:ascii="바탕" w:hAnsi="바탕" w:eastAsia="바탕"/>
+                <w:color w:val="000000"/>
+                <w:sz w:val="16"/>
+              </w:rPr>
+              <w:t>명시적 hard-negative fixture</w:t>
+            </w:r>
+          </w:p>
+        </w:tc>
+        <w:tc>
+          <w:tcPr>
+            <w:tcW w:type="dxa" w:w="1688"/>
+            <w:vAlign w:val="center"/>
+            <w:tcMar>
+              <w:top w:w="70" w:type="dxa"/>
+              <w:start w:w="100" w:type="dxa"/>
+              <w:bottom w:w="70" w:type="dxa"/>
+              <w:end w:w="100" w:type="dxa"/>
+            </w:tcMar>
+          </w:tcPr>
+          <w:p>
+            <w:pPr>
+              <w:spacing w:after="0" w:line="252" w:lineRule="auto"/>
+              <w:jc w:val="center"/>
+            </w:pPr>
+            <w:r>
+              <w:rPr>
+                <w:rFonts w:ascii="바탕" w:hAnsi="바탕" w:eastAsia="바탕"/>
+                <w:color w:val="000000"/>
+                <w:sz w:val="16"/>
+              </w:rPr>
+              <w:t>4</w:t>
+            </w:r>
+          </w:p>
+        </w:tc>
+        <w:tc>
+          <w:tcPr>
+            <w:tcW w:type="dxa" w:w="1998"/>
+            <w:vAlign w:val="center"/>
+            <w:tcMar>
+              <w:top w:w="70" w:type="dxa"/>
+              <w:start w:w="100" w:type="dxa"/>
+              <w:bottom w:w="70" w:type="dxa"/>
+              <w:end w:w="100" w:type="dxa"/>
+            </w:tcMar>
+          </w:tcPr>
+          <w:p>
+            <w:pPr>
+              <w:spacing w:after="0" w:line="252" w:lineRule="auto"/>
+              <w:jc w:val="center"/>
+            </w:pPr>
+            <w:r>
+              <w:rPr>
+                <w:rFonts w:ascii="바탕" w:hAnsi="바탕" w:eastAsia="바탕"/>
+                <w:color w:val="000000"/>
+                <w:sz w:val="16"/>
+              </w:rPr>
+              <w:t>1</w:t>
+            </w:r>
+          </w:p>
+        </w:tc>
+        <w:tc>
+          <w:tcPr>
+            <w:tcW w:type="dxa" w:w="1688"/>
+            <w:vAlign w:val="center"/>
+            <w:tcMar>
+              <w:top w:w="70" w:type="dxa"/>
+              <w:start w:w="100" w:type="dxa"/>
+              <w:bottom w:w="70" w:type="dxa"/>
+              <w:end w:w="100" w:type="dxa"/>
+            </w:tcMar>
+          </w:tcPr>
+          <w:p>
+            <w:pPr>
+              <w:spacing w:after="0" w:line="252" w:lineRule="auto"/>
+              <w:jc w:val="center"/>
+            </w:pPr>
+            <w:r>
+              <w:rPr>
+                <w:rFonts w:ascii="바탕" w:hAnsi="바탕" w:eastAsia="바탕"/>
+                <w:color w:val="000000"/>
+                <w:sz w:val="16"/>
+              </w:rPr>
+              <w:t>25.00%</w:t>
+            </w:r>
+          </w:p>
+        </w:tc>
+        <w:tc>
+          <w:tcPr>
+            <w:tcW w:type="dxa" w:w="2048"/>
+            <w:vAlign w:val="center"/>
+            <w:tcMar>
+              <w:top w:w="70" w:type="dxa"/>
+              <w:start w:w="100" w:type="dxa"/>
+              <w:bottom w:w="70" w:type="dxa"/>
+              <w:end w:w="100" w:type="dxa"/>
+            </w:tcMar>
+          </w:tcPr>
+          <w:p>
+            <w:pPr>
+              <w:spacing w:after="0" w:line="252" w:lineRule="auto"/>
+              <w:jc w:val="center"/>
+            </w:pPr>
+            <w:r>
+              <w:rPr>
+                <w:rFonts w:ascii="바탕" w:hAnsi="바탕" w:eastAsia="바탕"/>
+                <w:color w:val="000000"/>
+                <w:sz w:val="16"/>
+              </w:rPr>
+              <w:t>한국 전화번호 1</w:t>
+            </w:r>
+          </w:p>
+        </w:tc>
+      </w:tr>
+      <w:tr>
+        <w:trPr>
+          <w:cantSplit/>
+        </w:trPr>
+        <w:tc>
+          <w:tcPr>
+            <w:tcW w:type="dxa" w:w="2548"/>
+            <w:vAlign w:val="center"/>
+            <w:tcMar>
+              <w:top w:w="70" w:type="dxa"/>
+              <w:start w:w="100" w:type="dxa"/>
+              <w:bottom w:w="70" w:type="dxa"/>
+              <w:end w:w="100" w:type="dxa"/>
+            </w:tcMar>
+          </w:tcPr>
+          <w:p>
+            <w:pPr>
+              <w:spacing w:after="0" w:line="252" w:lineRule="auto"/>
+              <w:jc w:val="left"/>
+            </w:pPr>
+            <w:r>
+              <w:rPr>
+                <w:rFonts w:ascii="바탕" w:hAnsi="바탕" w:eastAsia="바탕"/>
+                <w:color w:val="000000"/>
+                <w:sz w:val="16"/>
+              </w:rPr>
+              <w:t>공식 법령 조문</w:t>
+            </w:r>
+          </w:p>
+        </w:tc>
+        <w:tc>
+          <w:tcPr>
+            <w:tcW w:type="dxa" w:w="1688"/>
+            <w:vAlign w:val="center"/>
+            <w:tcMar>
+              <w:top w:w="70" w:type="dxa"/>
+              <w:start w:w="100" w:type="dxa"/>
+              <w:bottom w:w="70" w:type="dxa"/>
+              <w:end w:w="100" w:type="dxa"/>
+            </w:tcMar>
+          </w:tcPr>
+          <w:p>
+            <w:pPr>
+              <w:spacing w:after="0" w:line="252" w:lineRule="auto"/>
+              <w:jc w:val="center"/>
+            </w:pPr>
+            <w:r>
+              <w:rPr>
+                <w:rFonts w:ascii="바탕" w:hAnsi="바탕" w:eastAsia="바탕"/>
+                <w:color w:val="000000"/>
+                <w:sz w:val="16"/>
+              </w:rPr>
+              <w:t>1,519</w:t>
+            </w:r>
+          </w:p>
+        </w:tc>
+        <w:tc>
+          <w:tcPr>
+            <w:tcW w:type="dxa" w:w="1998"/>
+            <w:vAlign w:val="center"/>
+            <w:tcMar>
+              <w:top w:w="70" w:type="dxa"/>
+              <w:start w:w="100" w:type="dxa"/>
+              <w:bottom w:w="70" w:type="dxa"/>
+              <w:end w:w="100" w:type="dxa"/>
+            </w:tcMar>
+          </w:tcPr>
+          <w:p>
+            <w:pPr>
+              <w:spacing w:after="0" w:line="252" w:lineRule="auto"/>
+              <w:jc w:val="center"/>
+            </w:pPr>
+            <w:r>
+              <w:rPr>
+                <w:rFonts w:ascii="바탕" w:hAnsi="바탕" w:eastAsia="바탕"/>
+                <w:color w:val="000000"/>
+                <w:sz w:val="16"/>
+              </w:rPr>
+              <w:t>29</w:t>
+            </w:r>
+          </w:p>
+        </w:tc>
+        <w:tc>
+          <w:tcPr>
+            <w:tcW w:type="dxa" w:w="1688"/>
+            <w:vAlign w:val="center"/>
+            <w:tcMar>
+              <w:top w:w="70" w:type="dxa"/>
+              <w:start w:w="100" w:type="dxa"/>
+              <w:bottom w:w="70" w:type="dxa"/>
+              <w:end w:w="100" w:type="dxa"/>
+            </w:tcMar>
+          </w:tcPr>
+          <w:p>
+            <w:pPr>
+              <w:spacing w:after="0" w:line="252" w:lineRule="auto"/>
+              <w:jc w:val="center"/>
+            </w:pPr>
+            <w:r>
+              <w:rPr>
+                <w:rFonts w:ascii="바탕" w:hAnsi="바탕" w:eastAsia="바탕"/>
+                <w:color w:val="000000"/>
+                <w:sz w:val="16"/>
+              </w:rPr>
+              <w:t>1.91%</w:t>
+            </w:r>
+          </w:p>
+        </w:tc>
+        <w:tc>
+          <w:tcPr>
+            <w:tcW w:type="dxa" w:w="2048"/>
+            <w:vAlign w:val="center"/>
+            <w:tcMar>
+              <w:top w:w="70" w:type="dxa"/>
+              <w:start w:w="100" w:type="dxa"/>
+              <w:bottom w:w="70" w:type="dxa"/>
+              <w:end w:w="100" w:type="dxa"/>
+            </w:tcMar>
+          </w:tcPr>
+          <w:p>
+            <w:pPr>
+              <w:spacing w:after="0" w:line="252" w:lineRule="auto"/>
+              <w:jc w:val="center"/>
+            </w:pPr>
+            <w:r>
+              <w:rPr>
+                <w:rFonts w:ascii="바탕" w:hAnsi="바탕" w:eastAsia="바탕"/>
+                <w:color w:val="000000"/>
+                <w:sz w:val="16"/>
+              </w:rPr>
+              <w:t>부서 18, 국적 11</w:t>
+            </w:r>
+          </w:p>
+        </w:tc>
+      </w:tr>
+    </w:tbl>
+    <w:p>
+      <w:pPr>
+        <w:spacing w:after="20"/>
+      </w:pPr>
     </w:p>
     <w:p>
       <w:pPr>
@@ -5706,7 +6351,23 @@
           <w:color w:val="000000"/>
           <w:sz w:val="19"/>
         </w:rPr>
-        <w:t>그러나 정상문장 생성기는 이름, 전화번호, 이메일, URL, 주소, 계좌·카드번호, 접근토큰 등 직접적인 PII 유사패턴을 의도적으로 피한다. 따라서 0%는 이 특정 회귀검사 자료에서의 결과일 뿐, 실제 상담·의료·금융 문장이나 경계 사례에서 오탐이 없다는 뜻이 아니다. 자연발생 자료와 PII 유사 hard negative를 포함한 외부 검증이 추가로 필요하다.</w:t>
+        <w:t>공식 법령 조문에서는 개인정보 보호법 842개 중 2개, 인공지능기본법 382개 중 18개, 대한민국헌법 295개 중 9개가 탐지되었다. 실제 식별값이 아니라 일반 법률문맥의 “대한민국”을 국적으로, “연구소”를 부서로 탐지한 키워드 단독 판정이었다. 명시적 hard negative에서는 예시용 전화번호 한 건을 실제 전화번호처럼 탐지하였다. 현 구현은 threshold 1에서 탐지 하나만 있어도 입력을 차단하므로 이 사례들은 가용성을 해칠 수 있는 과잉차단 후보다.</w:t>
+      </w:r>
+    </w:p>
+    <w:p>
+      <w:pPr>
+        <w:widowControl/>
+        <w:spacing w:before="0" w:after="60" w:line="331" w:lineRule="auto"/>
+        <w:ind w:firstLine="397"/>
+        <w:jc w:val="both"/>
+      </w:pPr>
+      <w:r>
+        <w:rPr>
+          <w:rFonts w:ascii="바탕" w:hAnsi="바탕" w:eastAsia="바탕"/>
+          <w:color w:val="000000"/>
+          <w:sz w:val="19"/>
+        </w:rPr>
+        <w:t>합성 정상문장 생성기는 직접적인 PII 유사패턴을 의도적으로 피하므로 0%는 회귀검사 결과일 뿐이다. 반대로 4건 fixture의 25%는 분모가 너무 작아 일반화할 수 없다. 법령 1.91%도 진성 개인정보가 없는 실제 공개문서에서 어휘적 오탐이 발생한다는 존재 증거이지, 의료·금융·상담 서비스의 오탐률 추정치는 아니다. 세 결과를 함께 보면 Layer 0의 추가 차단 효과와 키워드 탐지의 문맥 한계를 동시에 보고해야 한다.</w:t>
       </w:r>
     </w:p>
     <w:p>
@@ -7005,7 +7666,7 @@
           <w:color w:val="000000"/>
           <w:sz w:val="19"/>
         </w:rPr>
-        <w:t>가 조문 항을 뜻하는 잘못된 표기임을 확인하였다. 정확한 인용은 제71조 제4호다. 인공지능기본법 제33조를 위험관리 의무로 설명한 부분도 제34조로 수정해야 한다. “제재 최소 1년 유예”는 근거를 확인하지 못했다.</w:t>
+        <w:t>가 조문 항을 뜻하는 잘못된 표기임을 확인하였다. 정확한 인용은 제71조 제4호다. 인공지능기본법 제33조를 위험관리 의무로 설명한 부분도 제34조로 수정해야 한다. 법률 제21311호의 일부 개정 조문은 2026년 7월 21일 시행되지만, 본문이 인용한 제31조·제33조·제34조·제35조·제43조의 조문별 시행일은 모두 2026년 1월 22일이다. “제재 최소 1년 유예”는 근거를 확인하지 못했다.</w:t>
       </w:r>
     </w:p>
     <w:p>
@@ -7213,7 +7874,7 @@
           <w:color w:val="000000"/>
           <w:sz w:val="19"/>
         </w:rPr>
-        <w:t>다만 Layer 0는 독립된 완전방어가 아니다. 새 평가에서도 C 구성의 미차단은 706건이었고, 사전·패턴 기반 탐지는 새로운 표현과 문맥을 놓치거나 비민감 문장을 오탐할 수 있다. 합성 정상문장 10,000건에서 차단 오탐이 없었지만 생성기가 직접적인 PII 유사패턴을 제외했으므로 실제 오탐을 충분히 시험하지 못했다. 따라서 Layer 0는 “필요하지만 충분하지 않은” 입력 통제로 규정해야 한다.</w:t>
+        <w:t>다만 Layer 0는 독립된 완전방어가 아니다. 새 평가에서도 C 구성의 미차단은 706건이었다. 또한 합성 정상문장 10,000건에서는 오탐이 없었지만, 공식 법령 조문 1,519개 중 29개(1.91%)에서 “대한민국”과 “연구소” 같은 비식별 어휘가 국적·부서로 탐지되었다. 사전·패턴 기반 탐지는 새로운 표현과 문맥을 놓칠 뿐 아니라 일반 문장을 과잉차단할 수 있다. 따라서 Layer 0는 후속 계층과 문맥 점수·allowlist·감사 절차를 결합하는 “필요하지만 충분하지 않은” 입력 통제로 규정해야 한다.</w:t>
       </w:r>
     </w:p>
     <w:p>
@@ -7922,7 +8583,7 @@
           <w:color w:val="000000"/>
           <w:sz w:val="19"/>
         </w:rPr>
-        <w:t>논문은 탐지율뿐 아니라 효과크기와 95% 신뢰구간, 카테고리별 분모, 오류·타임아웃, 불확실 사례 수를 보고해야 한다. 실제 비민감 한국어 문장으로 구성한 hard-negative 세트를 사용하여 오탐도 함께 평가해야 한다.</w:t>
+        <w:t>논문은 탐지율뿐 아니라 효과크기와 95% 신뢰구간, 카테고리별 분모, 오류·타임아웃, 불확실 사례 수를 보고해야 한다. 본 연구의 법령 조문 감사처럼 재배포·출처 추적이 가능한 실제 비민감 한국어 문장으로 오탐을 확인하되, 한 도메인의 어휘분포를 일반화하지 않도록 의료·금융·상담·개발문서 등으로 외부검증 도메인을 확장해야 한다.</w:t>
       </w:r>
     </w:p>
     <w:p>
@@ -8322,7 +8983,7 @@
           <w:color w:val="000000"/>
           <w:sz w:val="19"/>
         </w:rPr>
-        <w:t>셋째, 합성 정상 한국어 10,000건은 PII 유사패턴을 의도적으로 피한다. 따라서 Layer 0의 실제 오탐률을 대표하지 않으며, 의료·금융·상담 도메인의 자연발생 hard negative가 필요하다.</w:t>
+        <w:t>셋째, 공개 법령 조문 1,519개를 추가하여 합성 정상 한국어의 약점을 일부 보완했지만, 법률문서만으로 의료·금융·상담 도메인의 어휘와 PII 유사 형식을 대표할 수 없다. 29개 탐지 사례는 자동 규칙과 단일 연구자의 문맥 판정에 따른 과잉차단 후보이며 독립 검토자 2인의 이중 라벨을 거치지 않았다. 따라서 1.91%를 실서비스 오탐률로 해석할 수 없고, 서비스 도메인의 자연발생 hard negative가 여전히 필요하다.</w:t>
       </w:r>
     </w:p>
     <w:p>
@@ -8434,7 +9095,7 @@
           <w:color w:val="000000"/>
           <w:sz w:val="19"/>
         </w:rPr>
-        <w:t>였다. 반대 방향 사례는 없었다. 따라서 한국어 생성형 AI 서비스에는 변형을 후속 계층 이전에 정규화하고 한국어 패턴을 검사하는 Layer 0가 필수 심층방어 계층으로 필요하다. 그러나 706건의 잔존 미차단과 제한된 오탐 자료는 Layer 0가 충분조건이 아님을 동시에 보여준다.</w:t>
+        <w:t>였다. 반대 방향 사례는 없었다. 따라서 한국어 생성형 AI 서비스에는 변형을 후속 계층 이전에 정규화하고 한국어 패턴을 검사하는 Layer 0가 필수 심층방어 계층으로 필요하다. 그러나 706건의 잔존 미차단과 공식 법령 조문 29건의 과잉차단 후보는 Layer 0가 충분조건이 아니며 문맥 기반 완화와 후속 검증이 필요함을 동시에 보여준다.</w:t>
       </w:r>
     </w:p>
     <w:p>
@@ -8450,7 +9111,7 @@
           <w:color w:val="000000"/>
           <w:sz w:val="19"/>
         </w:rPr>
-        <w:t>정책적 결론은 두 층위로 정리할 수 있다. 첫째, 현재 저장 실험에서는 변형된 한국어 PII의 기술적 유출 가능성이 증가하고 Layer 0가 이를 실질적으로 줄였으므로, 조직은 Layer 0와 동등한 입력 정규화·차단 기능을 배치하고 그 효과를 입증해야 한다. 둘째, 그 효과를 실제 서비스와 법적 준수에 일반화하려면 변이 후 gold span·단일 평가기·자연발생 hard negative·사람 검토·버전 공개·깨끗한 환경 재현을 갖추어야 한다. 형사정책은 특정 제품의 단일 점수를 처벌기준으로 삼기보다 보호조치의 실효성을 독립적으로 입증하도록 하는 절차와 감사가능성을 제도화해야 한다.</w:t>
+        <w:t>정책적 결론은 두 층위로 정리할 수 있다. 첫째, 현재 저장 실험에서는 변형된 한국어 PII의 기술적 유출 가능성이 증가하고 Layer 0가 이를 실질적으로 줄였으므로, 조직은 Layer 0와 동등한 입력 정규화·차단 기능을 배치하고 그 효과를 입증해야 한다. 둘째, 그 효과를 실제 서비스와 법적 준수에 일반화하려면 변이 후 gold span·단일 평가기·복수 도메인 hard negative·사람 검토·버전 공개·깨끗한 환경 재현을 갖추고 과잉차단도 함께 통제해야 한다. 형사정책은 특정 제품의 단일 점수를 처벌기준으로 삼기보다 보호조치의 실효성과 비례성을 독립적으로 입증하도록 하는 절차와 감사가능성을 제도화해야 한다.</w:t>
       </w:r>
     </w:p>
     <w:p>
@@ -8991,7 +9652,7 @@
           <w:color w:val="000000"/>
           <w:sz w:val="19"/>
         </w:rPr>
-        <w:t>인공지능 발전과 신뢰 기반 조성 등에 관한 기본법. 법률 제21311호, 2026. 1. 20. 일부개정, 2026. 7. 21. 시행.</w:t>
+        <w:t>인공지능 발전과 신뢰 기반 조성 등에 관한 기본법. 법률 제21311호, 2026. 1. 20. 일부개정. 본문 인용 조문 제31조·제33조·제34조·제35조·제43조 시행일 2026. 1. 22.; 일부 개정 조문 시행일 2026. 7. 21.</w:t>
       </w:r>
     </w:p>
     <w:p>
@@ -9007,7 +9668,7 @@
           <w:color w:val="000000"/>
           <w:sz w:val="19"/>
         </w:rPr>
-        <w:t xml:space="preserve">Amazon Web Services. </w:t>
+        <w:t xml:space="preserve">법제처. </w:t>
       </w:r>
       <w:r>
         <w:rPr>
@@ -9016,7 +9677,7 @@
           <w:color w:val="000000"/>
           <w:sz w:val="19"/>
         </w:rPr>
-        <w:t>Languages supported by Amazon Bedrock Guardrails</w:t>
+        <w:t>국가법령정보 공동활용 LAW OPEN DATA</w:t>
       </w:r>
       <w:r>
         <w:rPr>
@@ -9024,7 +9685,7 @@
           <w:color w:val="000000"/>
           <w:sz w:val="19"/>
         </w:rPr>
-        <w:t>. https://docs.aws.amazon.com/bedrock/latest/userguide/guardrails-supported-languages.html (접근일: 2026. 7. 26).</w:t>
+        <w:t>. https://open.law.go.kr/LSO/information/service.do (접근일: 2026. 7. 26).</w:t>
       </w:r>
     </w:p>
     <w:p>
@@ -9040,7 +9701,7 @@
           <w:color w:val="000000"/>
           <w:sz w:val="19"/>
         </w:rPr>
-        <w:t xml:space="preserve">Data Privacy Stack. </w:t>
+        <w:t xml:space="preserve">Amazon Web Services. </w:t>
       </w:r>
       <w:r>
         <w:rPr>
@@ -9049,7 +9710,7 @@
           <w:color w:val="000000"/>
           <w:sz w:val="19"/>
         </w:rPr>
-        <w:t>Presidio: Supported entities</w:t>
+        <w:t>Languages supported by Amazon Bedrock Guardrails</w:t>
       </w:r>
       <w:r>
         <w:rPr>
@@ -9057,7 +9718,7 @@
           <w:color w:val="000000"/>
           <w:sz w:val="19"/>
         </w:rPr>
-        <w:t>. https://presidio.dataprivacystack.org/supported_entities/ (접근일: 2026. 7. 26; Microsoft 문서의 현행 이전 위치).</w:t>
+        <w:t>. https://docs.aws.amazon.com/bedrock/latest/userguide/guardrails-supported-languages.html (접근일: 2026. 7. 26).</w:t>
       </w:r>
     </w:p>
     <w:p>
@@ -9073,7 +9734,7 @@
           <w:color w:val="000000"/>
           <w:sz w:val="19"/>
         </w:rPr>
-        <w:t xml:space="preserve">National Highway Traffic Safety Administration. </w:t>
+        <w:t xml:space="preserve">Data Privacy Stack. </w:t>
       </w:r>
       <w:r>
         <w:rPr>
@@ -9082,7 +9743,7 @@
           <w:color w:val="000000"/>
           <w:sz w:val="19"/>
         </w:rPr>
-        <w:t>The Vehicle Identification Number (VIN)</w:t>
+        <w:t>Presidio: Supported entities</w:t>
       </w:r>
       <w:r>
         <w:rPr>
@@ -9090,7 +9751,7 @@
           <w:color w:val="000000"/>
           <w:sz w:val="19"/>
         </w:rPr>
-        <w:t>. https://www.nhtsa.gov/document/vehicle-identification-number-vin</w:t>
+        <w:t>. https://presidio.dataprivacystack.org/supported_entities/ (접근일: 2026. 7. 26; Microsoft 문서의 현행 이전 위치).</w:t>
       </w:r>
     </w:p>
     <w:p>
@@ -9106,7 +9767,7 @@
           <w:color w:val="000000"/>
           <w:sz w:val="19"/>
         </w:rPr>
-        <w:t xml:space="preserve">U.S. Government Publishing Office. </w:t>
+        <w:t xml:space="preserve">National Highway Traffic Safety Administration. </w:t>
       </w:r>
       <w:r>
         <w:rPr>
@@ -9115,7 +9776,7 @@
           <w:color w:val="000000"/>
           <w:sz w:val="19"/>
         </w:rPr>
-        <w:t>49 CFR Part 565—Vehicle Identification Number Requirements</w:t>
+        <w:t>The Vehicle Identification Number (VIN)</w:t>
       </w:r>
       <w:r>
         <w:rPr>
@@ -9123,7 +9784,7 @@
           <w:color w:val="000000"/>
           <w:sz w:val="19"/>
         </w:rPr>
-        <w:t>. https://www.govinfo.gov/content/pkg/CFR-2019-title49-vol6/pdf/CFR-2019-title49-vol6-part565.pdf</w:t>
+        <w:t>. https://www.nhtsa.gov/document/vehicle-identification-number-vin</w:t>
       </w:r>
     </w:p>
     <w:p>
@@ -9139,7 +9800,24 @@
           <w:color w:val="000000"/>
           <w:sz w:val="19"/>
         </w:rPr>
-        <w:t>한국범죄학회. 「범죄와 정책」 소개. https://ksoc.re.kr/%EB%B2%94%EC%A3%84%EC%99%80-%EC%A0%95%EC%B1%85-%EC%86%8C%EA%B0%9C (접근일: 2026. 7. 26).</w:t>
+        <w:t xml:space="preserve">U.S. Government Publishing Office. </w:t>
+      </w:r>
+      <w:r>
+        <w:rPr>
+          <w:rFonts w:ascii="바탕" w:hAnsi="바탕" w:eastAsia="바탕"/>
+          <w:i/>
+          <w:color w:val="000000"/>
+          <w:sz w:val="19"/>
+        </w:rPr>
+        <w:t>49 CFR Part 565—Vehicle Identification Number Requirements</w:t>
+      </w:r>
+      <w:r>
+        <w:rPr>
+          <w:rFonts w:ascii="바탕" w:hAnsi="바탕" w:eastAsia="바탕"/>
+          <w:color w:val="000000"/>
+          <w:sz w:val="19"/>
+        </w:rPr>
+        <w:t>. https://www.govinfo.gov/content/pkg/CFR-2019-title49-vol6/pdf/CFR-2019-title49-vol6-part565.pdf</w:t>
       </w:r>
     </w:p>
     <w:p>
@@ -9155,23 +9833,7 @@
           <w:color w:val="000000"/>
           <w:sz w:val="19"/>
         </w:rPr>
-        <w:t>한국범죄학회. 「범죄와 정책」 편집규정. https://ksoc.re.kr/%ED%8E%B8%EC%A7%91%EA%B7%9C%EC%A0%95 (접근일: 2026. 7. 26).</w:t>
-      </w:r>
-    </w:p>
-    <w:p>
-      <w:pPr>
-        <w:pStyle w:val="Heading1"/>
-        <w:keepNext/>
-        <w:keepLines/>
-      </w:pPr>
-      <w:r>
-        <w:rPr>
-          <w:rFonts w:ascii="맑은 고딕" w:hAnsi="맑은 고딕" w:eastAsia="맑은 고딕"/>
-          <w:b/>
-          <w:color w:val="000000"/>
-          <w:sz w:val="25"/>
-        </w:rPr>
-        <w:t>부록: 결과 해석을 위한 주의문</w:t>
+        <w:t>한국범죄학회. 「범죄와 정책」 소개. https://ksoc.re.kr/%EB%B2%94%EC%A3%84%EC%99%80-%EC%A0%95%EC%B1%85-%EC%86%8C%EA%B0%9C (접근일: 2026. 7. 26).</w:t>
       </w:r>
     </w:p>
     <w:p>
@@ -9187,7 +9849,23 @@
           <w:color w:val="000000"/>
           <w:sz w:val="19"/>
         </w:rPr>
-        <w:t>본 원고의 1차 분석은 10,000건 중 변이 후 보호대상을 자동 복원할 수 있었던 9,964건과, 동일 원천값으로 연결된 3,461쌍을 대상으로 한다. 복원 스크립트는 문자열을 원형으로 정규화했을 뿐 보호대상이 남은 경우를 차단 성공으로 계산하지 않으며, 36건의 불확실 사례는 제외한다.</w:t>
+        <w:t>한국범죄학회. 「범죄와 정책」 편집규정. https://ksoc.re.kr/%ED%8E%B8%EC%A7%91%EA%B7%9C%EC%A0%95 (접근일: 2026. 7. 26).</w:t>
+      </w:r>
+    </w:p>
+    <w:p>
+      <w:pPr>
+        <w:pStyle w:val="Heading1"/>
+        <w:keepNext/>
+        <w:keepLines/>
+      </w:pPr>
+      <w:r>
+        <w:rPr>
+          <w:rFonts w:ascii="맑은 고딕" w:hAnsi="맑은 고딕" w:eastAsia="맑은 고딕"/>
+          <w:b/>
+          <w:color w:val="000000"/>
+          <w:sz w:val="25"/>
+        </w:rPr>
+        <w:t>부록: 결과 해석을 위한 주의문</w:t>
       </w:r>
     </w:p>
     <w:p>
@@ -9203,7 +9881,23 @@
           <w:color w:val="000000"/>
           <w:sz w:val="19"/>
         </w:rPr>
-        <w:t>A/B/C/D 수치는 같은 저장 산출물에 새 평가기를 적용한 감사 결과다. 당시 제품 설정을 복원한 전향적 재실행이나 현재 제품의 보편적 순위를 뜻하지 않는다. 제품 선택이나 규제기준에 사용하려면 자동 복원 표본의 독립 사람 검토, 자연발생 hard negative, 설정을 고정한 재실험이 추가되어야 한다.</w:t>
+        <w:t>본 원고의 1차 분석은 10,000건 중 변이 후 보호대상을 자동 복원할 수 있었던 9,964건과, 동일 원천값으로 연결된 3,461쌍을 대상으로 한다. 복원 스크립트는 문자열을 원형으로 정규화했을 뿐 보호대상이 남은 경우를 차단 성공으로 계산하지 않으며, 36건의 불확실 사례는 제외한다.</w:t>
+      </w:r>
+    </w:p>
+    <w:p>
+      <w:pPr>
+        <w:widowControl/>
+        <w:spacing w:before="0" w:after="60" w:line="331" w:lineRule="auto"/>
+        <w:ind w:firstLine="397"/>
+        <w:jc w:val="both"/>
+      </w:pPr>
+      <w:r>
+        <w:rPr>
+          <w:rFonts w:ascii="바탕" w:hAnsi="바탕" w:eastAsia="바탕"/>
+          <w:color w:val="000000"/>
+          <w:sz w:val="19"/>
+        </w:rPr>
+        <w:t>A/B/C/D 수치는 같은 저장 산출물에 새 평가기를 적용한 감사 결과다. 당시 제품 설정을 복원한 전향적 재실행이나 현재 제품의 보편적 순위를 뜻하지 않는다. 법령 조문 감사는 실제 공개문서에서 어휘적 과잉차단이 발생함을 확인했지만 서비스 도메인을 대표하지 않는다. 제품 선택이나 규제기준에 사용하려면 자동 복원 표본과 hard negative의 독립 사람 검토, 복수 서비스 도메인 외부검증, 설정을 고정한 재실험이 추가되어야 한다.</w:t>
       </w:r>
     </w:p>
     <w:sectPr>

</xml_diff>

<commit_message>
docs: complete citation and journal structure audit
</commit_message>
<xml_diff>
--- a/paper/범죄와정책_투고원고_검증본.docx
+++ b/paper/범죄와정책_투고원고_검증본.docx
@@ -14,7 +14,7 @@
           <w:color w:val="000000"/>
           <w:sz w:val="36"/>
         </w:rPr>
-        <w:t>생성형 AI의 한국어 민감정보 유출 위험과 정규화 기반 Layer 0의 필요성</w:t>
+        <w:t>생성형 AI의 한국어 개인식별정보(PII) 유출 위험과 정규화 기반 Layer 0의 필요성</w:t>
       </w:r>
     </w:p>
     <w:p>
@@ -44,7 +44,7 @@
           <w:color w:val="000000"/>
           <w:sz w:val="20"/>
         </w:rPr>
-        <w:t>Korean Sensitive-Information Leakage Risks in Generative AI and the Need for a Normalization-Based Layer 0: A Post-Mutation Gold Reconstruction and Matched Guardrail Audit</w:t>
+        <w:t>Korean Personally Identifiable Information Leakage Risks in Generative AI and the Need for a Normalization-Based Layer 0: A Post-Mutation Gold Reconstruction and Matched Guardrail Audit</w:t>
       </w:r>
     </w:p>
     <w:p>

</xml_diff>

<commit_message>
docs: add service-domain overblocking audit
</commit_message>
<xml_diff>
--- a/paper/범죄와정책_투고원고_검증본.docx
+++ b/paper/범죄와정책_투고원고_검증본.docx
@@ -221,7 +221,7 @@
           <w:color w:val="000000"/>
           <w:sz w:val="19"/>
         </w:rPr>
-        <w:t>Layer 0 코드와 함께 저장된 합성 정상 한국어 10,000건에서는 차단 오탐이 0건이었다. 그러나 PII 유사패턴을 의도적으로 제외한 자료였으므로, 국가법령정보센터의 공식 XML에서 개인정보 보호법·인공지능기본법·대한민국헌법의 비식별 조문 단위 1,519개를 추가 추출해 같은 코드를 적용하였다. 그 결과 29개(1.91%)가 국적 또는 부서 정보로 탐지되어 과잉차단 후보가 되었다. 이는 Layer 0의 필요성과 별개로 키워드 단독 탐지의 문맥 한계를 보여주지만, 법률문서 단일 도메인이므로 실제 서비스 오탐률로 일반화할 수 없다. 또한 36건은 변이 후 정답을 복원하지 못했고, 동명 표본 파일의 10,000/3,538건 충돌, 필수 코퍼스 누락, 테스트 실패, VIN 체크디지트 오류와 지연·비용 서술 불일치도 확인되었다.</w:t>
+        <w:t>Layer 0 코드와 함께 저장된 합성 정상 한국어 10,000건에서는 차단 오탐이 0건이었다. 그러나 PII 유사패턴을 의도적으로 제외한 자료였으므로, 국가법령정보센터의 공식 XML에서 비식별 조문 단위 1,519개를 추가해 29개(1.91%)의 과잉차단 후보를 확인하였다. 이어 질병관리청·금융위원회·AWS·Python 공식 문서에서 직접 식별자형 문자열과 연락처 메타데이터를 제외한 의료·금융·지원·개발문서 693개를 추출하였다. 이 중 48개(6.93%)가 탐지되었고, 의료 일반교육 문장은 265개 중 44개(16.60%), 개발문서는 255개 중 4개(1.57%)였으며 금융 29개와 지원 144개에서는 탐지가 없었다. 이는 키워드·값 패턴의 문맥 한계가 도메인별로 크게 다름을 보여주지만, 편의추출한 공개 문서이므로 실제 서비스 오탐률로 일반화할 수 없다. 또한 36건은 변이 후 정답을 복원하지 못했고, 동명 표본 파일의 10,000/3,538건 충돌, 필수 코퍼스 누락, 테스트 실패, VIN 체크디지트 오류와 지연·비용 서술 불일치도 확인되었다.</w:t>
       </w:r>
     </w:p>
     <w:p>
@@ -358,7 +358,7 @@
           <w:color w:val="000000"/>
           <w:sz w:val="19"/>
         </w:rPr>
-        <w:t>Layer 0 produced zero blocks on a stored synthetic clean-Korean set of 10,000 documents, but that set deliberately excludes direct PII-like patterns. A supplemental audit therefore extracted 1,519 non-personal provision units from the official XML versions of the Personal Information Protection Act, the AI Basic Act, and the Constitution. Layer 0 flagged 29 units (1.91%) as nationality or department information, revealing lexical overblocking that the synthetic clean set missed. This single public-law domain still cannot establish a real-world false-positive rate. Thirty-six payloads remained unreconstructed. The audit also identified conflicting 10,000/3,538-row files, missing required corpora, test failures, invalid VIN check digits, and latency and cost inconsistencies.</w:t>
+        <w:t>Layer 0 produced zero blocks on a stored synthetic clean-Korean set of 10,000 documents, but that set deliberately excludes direct PII-like patterns. A supplemental audit extracted 1,519 non-personal statutory units and found 29 overblocking candidates (1.91%). It then extracted 693 non-case units from official Korean medical, finance, customer-support, and developer documents after excluding contact metadata and direct identifier-like strings. Layer 0 flagged 48 units (6.93%): 44 of 265 medical units (16.60%) and 4 of 255 developer units (1.57%), while flagging none of 29 finance or 144 support units. The domain variation reveals lexical overblocking missed by the synthetic clean set, but this convenience sample of public pages cannot establish a production false-positive rate. Thirty-six payloads remained unreconstructed. The audit also identified conflicting 10,000/3,538-row files, missing required corpora, test failures, invalid VIN check digits, and latency and cost inconsistencies.</w:t>
       </w:r>
     </w:p>
     <w:p>
@@ -650,7 +650,7 @@
           <w:color w:val="000000"/>
           <w:sz w:val="19"/>
         </w:rPr>
-        <w:t>연구의 기여는 네 가지다. 첫째, 기존 평가기가 놓친 변이 후 보호대상 문자열을 9,964건에서 복원하는 감사용 평가기를 구현하였다. 둘째, 동일 PII 유형·원천값의 원형과 변이 사례 3,461쌍을 구성하고, 한국어·보호대상 변경 여부를 구분하여 변이 위험을 재추정하였다. 셋째, 기존 계층이 놓쳤으나 Layer 0 추가 구성이 차단한 1,354건과 그중 Layer 0의 직접 차단 1,353건을 확인하고, 합성 정상문 10,000건과 공식 법령 조문 1,519개에서 과잉차단을 함께 측정하였다. 넷째, 법적 범주, 범죄학적 보호자 개념, 제품 지원 문서와 실험 설정을 분리하고 정책 연구를 위한 최소 보고·재현 기준을 제안하였다.</w:t>
+        <w:t>연구의 기여는 네 가지다. 첫째, 기존 평가기가 놓친 변이 후 보호대상 문자열을 9,964건에서 복원하는 감사용 평가기를 구현하였다. 둘째, 동일 PII 유형·원천값의 원형과 변이 사례 3,461쌍을 구성하고, 한국어·보호대상 변경 여부를 구분하여 변이 위험을 재추정하였다. 셋째, 기존 계층이 놓쳤으나 Layer 0 추가 구성이 차단한 1,354건과 그중 Layer 0의 직접 차단 1,353건을 확인하고, 합성 정상문 10,000건·공식 법령 1,519개·네 서비스 도메인 공식 문서 693개에서 과잉차단을 함께 측정하였다. 넷째, 법적 범주, 범죄학적 보호자 개념, 제품 지원 문서와 실험 설정을 분리하고 정책 연구를 위한 최소 보고·재현 기준을 제안하였다.</w:t>
       </w:r>
     </w:p>
     <w:p>
@@ -2294,7 +2294,7 @@
           <w:color w:val="000000"/>
           <w:sz w:val="19"/>
         </w:rPr>
-        <w:t xml:space="preserve">오탐에 대한 보조검사는 세 단계로 수행하였다. 첫째, 저장소의 </w:t>
+        <w:t xml:space="preserve">오탐에 대한 보조검사는 네 단계로 수행하였다. 첫째, 저장소의 </w:t>
       </w:r>
       <w:r>
         <w:rPr>
@@ -2390,7 +2390,87 @@
           <w:color w:val="000000"/>
           <w:sz w:val="19"/>
         </w:rPr>
-        <w:t>는 원문을 출력하지 않고 법령 XML·코드·평가자료의 SHA-256과 집계만 출력한다. 법령 조문은 실제 공개문서이지만 의료·금융·상담 트래픽을 대표하지 않으므로, 이 결과도 실서비스 오탐률로 해석하지 않는다.</w:t>
+        <w:t>는 원문을 출력하지 않고 법령 XML·코드·평가자료의 SHA-256과 집계만 출력한다.</w:t>
+      </w:r>
+    </w:p>
+    <w:p>
+      <w:pPr>
+        <w:widowControl/>
+        <w:spacing w:before="0" w:after="60" w:line="331" w:lineRule="auto"/>
+        <w:ind w:firstLine="397"/>
+        <w:jc w:val="both"/>
+      </w:pPr>
+      <w:r>
+        <w:rPr>
+          <w:rFonts w:ascii="바탕" w:hAnsi="바탕" w:eastAsia="바탕"/>
+          <w:color w:val="000000"/>
+          <w:sz w:val="19"/>
+        </w:rPr>
+        <w:t xml:space="preserve">넷째, </w:t>
+      </w:r>
+      <w:r>
+        <w:rPr>
+          <w:rFonts w:ascii="Consolas" w:hAnsi="Consolas" w:eastAsia="Consolas"/>
+          <w:color w:val="000000"/>
+          <w:sz w:val="18"/>
+        </w:rPr>
+        <w:t>paper/audit_public_service_hard_negatives.py</w:t>
+      </w:r>
+      <w:r>
+        <w:rPr>
+          <w:rFonts w:ascii="바탕" w:hAnsi="바탕" w:eastAsia="바탕"/>
+          <w:color w:val="000000"/>
+          <w:sz w:val="19"/>
+        </w:rPr>
+        <w:t xml:space="preserve">로 질병관리청 국가건강정보포털 5개 페이지, 금융위원회 금융교육 8개 페이지, AWS Support 4개 페이지, Python 3.13 한국어 자습서 4개 페이지의 본문을 직접 수집하였다. 본문 컨테이너 안의 제목·문단·목록·표 셀 중 20자 이상 한국어 단위만 남기고, 연락처 메타데이터, URL·이메일·전화번호·주민등록번호·카드번호·IP·MAC·AWS 키와 같은 직접 식별자형 문자열 및 완전일치 중복을 제외하였다. 최종 693개 문단의 출처 URL과 본문 SHA-256을 </w:t>
+      </w:r>
+      <w:r>
+        <w:rPr>
+          <w:rFonts w:ascii="Consolas" w:hAnsi="Consolas" w:eastAsia="Consolas"/>
+          <w:color w:val="000000"/>
+          <w:sz w:val="18"/>
+        </w:rPr>
+        <w:t>paper/public_service_hard_negative_audit.json</w:t>
+      </w:r>
+      <w:r>
+        <w:rPr>
+          <w:rFonts w:ascii="바탕" w:hAnsi="바탕" w:eastAsia="바탕"/>
+          <w:color w:val="000000"/>
+          <w:sz w:val="19"/>
+        </w:rPr>
+        <w:t xml:space="preserve">에 고정하였다. 탐지된 48건의 원문·위치·해시는 </w:t>
+      </w:r>
+      <w:r>
+        <w:rPr>
+          <w:rFonts w:ascii="Consolas" w:hAnsi="Consolas" w:eastAsia="Consolas"/>
+          <w:color w:val="000000"/>
+          <w:sz w:val="18"/>
+        </w:rPr>
+        <w:t>--review</w:t>
+      </w:r>
+      <w:r>
+        <w:rPr>
+          <w:rFonts w:ascii="바탕" w:hAnsi="바탕" w:eastAsia="바탕"/>
+          <w:color w:val="000000"/>
+          <w:sz w:val="19"/>
+        </w:rPr>
+        <w:t xml:space="preserve">로 재현되며 </w:t>
+      </w:r>
+      <w:r>
+        <w:rPr>
+          <w:rFonts w:ascii="Consolas" w:hAnsi="Consolas" w:eastAsia="Consolas"/>
+          <w:color w:val="000000"/>
+          <w:sz w:val="18"/>
+        </w:rPr>
+        <w:t>paper/서비스도메인_오탐_2인독립검토표.md</w:t>
+      </w:r>
+      <w:r>
+        <w:rPr>
+          <w:rFonts w:ascii="바탕" w:hAnsi="바탕" w:eastAsia="바탕"/>
+          <w:color w:val="000000"/>
+          <w:sz w:val="19"/>
+        </w:rPr>
+        <w:t>에서 독립 판정하도록 하였다. 이 자료 역시 공식 공개문서의 목적표본이지 실제 운영 트래픽의 확률표본이 아니다.</w:t>
       </w:r>
     </w:p>
     <w:p>
@@ -5738,7 +5818,7 @@
           <w:color w:val="000000"/>
           <w:sz w:val="22"/>
         </w:rPr>
-        <w:t>5. Layer 0의 정상문장·법령 하드 네거티브 오탐</w:t>
+        <w:t>5. Layer 0의 정상문장·법령·서비스 도메인 하드 네거티브 오탐</w:t>
       </w:r>
     </w:p>
     <w:p>
@@ -5775,11 +5855,11 @@
         </w:tblBorders>
       </w:tblPr>
       <w:tblGrid>
-        <w:gridCol w:w="2548"/>
-        <w:gridCol w:w="1688"/>
-        <w:gridCol w:w="1998"/>
-        <w:gridCol w:w="1688"/>
-        <w:gridCol w:w="2048"/>
+        <w:gridCol w:w="2293"/>
+        <w:gridCol w:w="1566"/>
+        <w:gridCol w:w="1828"/>
+        <w:gridCol w:w="1566"/>
+        <w:gridCol w:w="2717"/>
       </w:tblGrid>
       <w:tr>
         <w:trPr>
@@ -5788,7 +5868,7 @@
         </w:trPr>
         <w:tc>
           <w:tcPr>
-            <w:tcW w:type="dxa" w:w="2548"/>
+            <w:tcW w:type="dxa" w:w="2293"/>
             <w:vAlign w:val="center"/>
             <w:shd w:fill="E7E7E7"/>
             <w:tcMar>
@@ -5816,7 +5896,7 @@
         </w:tc>
         <w:tc>
           <w:tcPr>
-            <w:tcW w:type="dxa" w:w="1688"/>
+            <w:tcW w:type="dxa" w:w="1566"/>
             <w:vAlign w:val="center"/>
             <w:shd w:fill="E7E7E7"/>
             <w:tcMar>
@@ -5844,7 +5924,7 @@
         </w:tc>
         <w:tc>
           <w:tcPr>
-            <w:tcW w:type="dxa" w:w="1998"/>
+            <w:tcW w:type="dxa" w:w="1828"/>
             <w:vAlign w:val="center"/>
             <w:shd w:fill="E7E7E7"/>
             <w:tcMar>
@@ -5872,7 +5952,7 @@
         </w:tc>
         <w:tc>
           <w:tcPr>
-            <w:tcW w:type="dxa" w:w="1688"/>
+            <w:tcW w:type="dxa" w:w="1566"/>
             <w:vAlign w:val="center"/>
             <w:shd w:fill="E7E7E7"/>
             <w:tcMar>
@@ -5900,7 +5980,7 @@
         </w:tc>
         <w:tc>
           <w:tcPr>
-            <w:tcW w:type="dxa" w:w="2048"/>
+            <w:tcW w:type="dxa" w:w="2717"/>
             <w:vAlign w:val="center"/>
             <w:shd w:fill="E7E7E7"/>
             <w:tcMar>
@@ -5933,7 +6013,7 @@
         </w:trPr>
         <w:tc>
           <w:tcPr>
-            <w:tcW w:type="dxa" w:w="2548"/>
+            <w:tcW w:type="dxa" w:w="2293"/>
             <w:vAlign w:val="center"/>
             <w:tcMar>
               <w:top w:w="70" w:type="dxa"/>
@@ -5959,7 +6039,7 @@
         </w:tc>
         <w:tc>
           <w:tcPr>
-            <w:tcW w:type="dxa" w:w="1688"/>
+            <w:tcW w:type="dxa" w:w="1566"/>
             <w:vAlign w:val="center"/>
             <w:tcMar>
               <w:top w:w="70" w:type="dxa"/>
@@ -5985,7 +6065,7 @@
         </w:tc>
         <w:tc>
           <w:tcPr>
-            <w:tcW w:type="dxa" w:w="1998"/>
+            <w:tcW w:type="dxa" w:w="1828"/>
             <w:vAlign w:val="center"/>
             <w:tcMar>
               <w:top w:w="70" w:type="dxa"/>
@@ -6011,7 +6091,7 @@
         </w:tc>
         <w:tc>
           <w:tcPr>
-            <w:tcW w:type="dxa" w:w="1688"/>
+            <w:tcW w:type="dxa" w:w="1566"/>
             <w:vAlign w:val="center"/>
             <w:tcMar>
               <w:top w:w="70" w:type="dxa"/>
@@ -6037,7 +6117,7 @@
         </w:tc>
         <w:tc>
           <w:tcPr>
-            <w:tcW w:type="dxa" w:w="2048"/>
+            <w:tcW w:type="dxa" w:w="2717"/>
             <w:vAlign w:val="center"/>
             <w:tcMar>
               <w:top w:w="70" w:type="dxa"/>
@@ -6068,7 +6148,7 @@
         </w:trPr>
         <w:tc>
           <w:tcPr>
-            <w:tcW w:type="dxa" w:w="2548"/>
+            <w:tcW w:type="dxa" w:w="2293"/>
             <w:vAlign w:val="center"/>
             <w:tcMar>
               <w:top w:w="70" w:type="dxa"/>
@@ -6094,7 +6174,7 @@
         </w:tc>
         <w:tc>
           <w:tcPr>
-            <w:tcW w:type="dxa" w:w="1688"/>
+            <w:tcW w:type="dxa" w:w="1566"/>
             <w:vAlign w:val="center"/>
             <w:tcMar>
               <w:top w:w="70" w:type="dxa"/>
@@ -6120,7 +6200,7 @@
         </w:tc>
         <w:tc>
           <w:tcPr>
-            <w:tcW w:type="dxa" w:w="1998"/>
+            <w:tcW w:type="dxa" w:w="1828"/>
             <w:vAlign w:val="center"/>
             <w:tcMar>
               <w:top w:w="70" w:type="dxa"/>
@@ -6146,7 +6226,7 @@
         </w:tc>
         <w:tc>
           <w:tcPr>
-            <w:tcW w:type="dxa" w:w="1688"/>
+            <w:tcW w:type="dxa" w:w="1566"/>
             <w:vAlign w:val="center"/>
             <w:tcMar>
               <w:top w:w="70" w:type="dxa"/>
@@ -6172,7 +6252,7 @@
         </w:tc>
         <w:tc>
           <w:tcPr>
-            <w:tcW w:type="dxa" w:w="2048"/>
+            <w:tcW w:type="dxa" w:w="2717"/>
             <w:vAlign w:val="center"/>
             <w:tcMar>
               <w:top w:w="70" w:type="dxa"/>
@@ -6203,7 +6283,7 @@
         </w:trPr>
         <w:tc>
           <w:tcPr>
-            <w:tcW w:type="dxa" w:w="2548"/>
+            <w:tcW w:type="dxa" w:w="2293"/>
             <w:vAlign w:val="center"/>
             <w:tcMar>
               <w:top w:w="70" w:type="dxa"/>
@@ -6229,7 +6309,7 @@
         </w:tc>
         <w:tc>
           <w:tcPr>
-            <w:tcW w:type="dxa" w:w="1688"/>
+            <w:tcW w:type="dxa" w:w="1566"/>
             <w:vAlign w:val="center"/>
             <w:tcMar>
               <w:top w:w="70" w:type="dxa"/>
@@ -6255,7 +6335,7 @@
         </w:tc>
         <w:tc>
           <w:tcPr>
-            <w:tcW w:type="dxa" w:w="1998"/>
+            <w:tcW w:type="dxa" w:w="1828"/>
             <w:vAlign w:val="center"/>
             <w:tcMar>
               <w:top w:w="70" w:type="dxa"/>
@@ -6281,7 +6361,7 @@
         </w:tc>
         <w:tc>
           <w:tcPr>
-            <w:tcW w:type="dxa" w:w="1688"/>
+            <w:tcW w:type="dxa" w:w="1566"/>
             <w:vAlign w:val="center"/>
             <w:tcMar>
               <w:top w:w="70" w:type="dxa"/>
@@ -6307,7 +6387,7 @@
         </w:tc>
         <w:tc>
           <w:tcPr>
-            <w:tcW w:type="dxa" w:w="2048"/>
+            <w:tcW w:type="dxa" w:w="2717"/>
             <w:vAlign w:val="center"/>
             <w:tcMar>
               <w:top w:w="70" w:type="dxa"/>
@@ -6332,6 +6412,141 @@
           </w:p>
         </w:tc>
       </w:tr>
+      <w:tr>
+        <w:trPr>
+          <w:cantSplit/>
+        </w:trPr>
+        <w:tc>
+          <w:tcPr>
+            <w:tcW w:type="dxa" w:w="2293"/>
+            <w:vAlign w:val="center"/>
+            <w:tcMar>
+              <w:top w:w="70" w:type="dxa"/>
+              <w:start w:w="100" w:type="dxa"/>
+              <w:bottom w:w="70" w:type="dxa"/>
+              <w:end w:w="100" w:type="dxa"/>
+            </w:tcMar>
+          </w:tcPr>
+          <w:p>
+            <w:pPr>
+              <w:spacing w:after="0" w:line="252" w:lineRule="auto"/>
+              <w:jc w:val="left"/>
+            </w:pPr>
+            <w:r>
+              <w:rPr>
+                <w:rFonts w:ascii="바탕" w:hAnsi="바탕" w:eastAsia="바탕"/>
+                <w:color w:val="000000"/>
+                <w:sz w:val="16"/>
+              </w:rPr>
+              <w:t>공식 서비스 도메인 문서</w:t>
+            </w:r>
+          </w:p>
+        </w:tc>
+        <w:tc>
+          <w:tcPr>
+            <w:tcW w:type="dxa" w:w="1566"/>
+            <w:vAlign w:val="center"/>
+            <w:tcMar>
+              <w:top w:w="70" w:type="dxa"/>
+              <w:start w:w="100" w:type="dxa"/>
+              <w:bottom w:w="70" w:type="dxa"/>
+              <w:end w:w="100" w:type="dxa"/>
+            </w:tcMar>
+          </w:tcPr>
+          <w:p>
+            <w:pPr>
+              <w:spacing w:after="0" w:line="252" w:lineRule="auto"/>
+              <w:jc w:val="center"/>
+            </w:pPr>
+            <w:r>
+              <w:rPr>
+                <w:rFonts w:ascii="바탕" w:hAnsi="바탕" w:eastAsia="바탕"/>
+                <w:color w:val="000000"/>
+                <w:sz w:val="16"/>
+              </w:rPr>
+              <w:t>693</w:t>
+            </w:r>
+          </w:p>
+        </w:tc>
+        <w:tc>
+          <w:tcPr>
+            <w:tcW w:type="dxa" w:w="1828"/>
+            <w:vAlign w:val="center"/>
+            <w:tcMar>
+              <w:top w:w="70" w:type="dxa"/>
+              <w:start w:w="100" w:type="dxa"/>
+              <w:bottom w:w="70" w:type="dxa"/>
+              <w:end w:w="100" w:type="dxa"/>
+            </w:tcMar>
+          </w:tcPr>
+          <w:p>
+            <w:pPr>
+              <w:spacing w:after="0" w:line="252" w:lineRule="auto"/>
+              <w:jc w:val="center"/>
+            </w:pPr>
+            <w:r>
+              <w:rPr>
+                <w:rFonts w:ascii="바탕" w:hAnsi="바탕" w:eastAsia="바탕"/>
+                <w:color w:val="000000"/>
+                <w:sz w:val="16"/>
+              </w:rPr>
+              <w:t>48</w:t>
+            </w:r>
+          </w:p>
+        </w:tc>
+        <w:tc>
+          <w:tcPr>
+            <w:tcW w:type="dxa" w:w="1566"/>
+            <w:vAlign w:val="center"/>
+            <w:tcMar>
+              <w:top w:w="70" w:type="dxa"/>
+              <w:start w:w="100" w:type="dxa"/>
+              <w:bottom w:w="70" w:type="dxa"/>
+              <w:end w:w="100" w:type="dxa"/>
+            </w:tcMar>
+          </w:tcPr>
+          <w:p>
+            <w:pPr>
+              <w:spacing w:after="0" w:line="252" w:lineRule="auto"/>
+              <w:jc w:val="center"/>
+            </w:pPr>
+            <w:r>
+              <w:rPr>
+                <w:rFonts w:ascii="바탕" w:hAnsi="바탕" w:eastAsia="바탕"/>
+                <w:color w:val="000000"/>
+                <w:sz w:val="16"/>
+              </w:rPr>
+              <w:t>6.93%</w:t>
+            </w:r>
+          </w:p>
+        </w:tc>
+        <w:tc>
+          <w:tcPr>
+            <w:tcW w:type="dxa" w:w="2717"/>
+            <w:vAlign w:val="center"/>
+            <w:tcMar>
+              <w:top w:w="70" w:type="dxa"/>
+              <w:start w:w="100" w:type="dxa"/>
+              <w:bottom w:w="70" w:type="dxa"/>
+              <w:end w:w="100" w:type="dxa"/>
+            </w:tcMar>
+          </w:tcPr>
+          <w:p>
+            <w:pPr>
+              <w:spacing w:after="0" w:line="252" w:lineRule="auto"/>
+              <w:jc w:val="center"/>
+            </w:pPr>
+            <w:r>
+              <w:rPr>
+                <w:rFonts w:ascii="바탕" w:hAnsi="바탕" w:eastAsia="바탕"/>
+                <w:color w:val="000000"/>
+                <w:sz w:val="16"/>
+              </w:rPr>
+              <w:t>진단 41, 정신건강 7, 처방 4, 알레르기 1, 학점 5</w:t>
+            </w:r>
+          </w:p>
+        </w:tc>
+      </w:tr>
     </w:tbl>
     <w:p>
       <w:pPr>
@@ -6367,7 +6582,55 @@
           <w:color w:val="000000"/>
           <w:sz w:val="19"/>
         </w:rPr>
-        <w:t>합성 정상문장 생성기는 직접적인 PII 유사패턴을 의도적으로 피하므로 0%는 회귀검사 결과일 뿐이다. 반대로 4건 fixture의 25%는 분모가 너무 작아 일반화할 수 없다. 법령 1.91%도 진성 개인정보가 없는 실제 공개문서에서 어휘적 오탐이 발생한다는 존재 증거이지, 의료·금융·상담 서비스의 오탐률 추정치는 아니다. 세 결과를 함께 보면 Layer 0의 추가 차단 효과와 키워드 탐지의 문맥 한계를 동시에 보고해야 한다.</w:t>
+        <w:t xml:space="preserve">서비스 도메인에서는 의료 265개 중 44개(16.60%)가 주로 </w:t>
+      </w:r>
+      <w:r>
+        <w:rPr>
+          <w:rFonts w:ascii="Consolas" w:hAnsi="Consolas" w:eastAsia="Consolas"/>
+          <w:color w:val="000000"/>
+          <w:sz w:val="18"/>
+        </w:rPr>
+        <w:t>diagnosis</w:t>
+      </w:r>
+      <w:r>
+        <w:rPr>
+          <w:rFonts w:ascii="바탕" w:hAnsi="바탕" w:eastAsia="바탕"/>
+          <w:color w:val="000000"/>
+          <w:sz w:val="19"/>
+        </w:rPr>
+        <w:t xml:space="preserve">로, 개발문서 255개 중 4개(1.57%)가 프로그래밍 예문의 A/B/C 표기를 </w:t>
+      </w:r>
+      <w:r>
+        <w:rPr>
+          <w:rFonts w:ascii="Consolas" w:hAnsi="Consolas" w:eastAsia="Consolas"/>
+          <w:color w:val="000000"/>
+          <w:sz w:val="18"/>
+        </w:rPr>
+        <w:t>course_grade</w:t>
+      </w:r>
+      <w:r>
+        <w:rPr>
+          <w:rFonts w:ascii="바탕" w:hAnsi="바탕" w:eastAsia="바탕"/>
+          <w:color w:val="000000"/>
+          <w:sz w:val="19"/>
+        </w:rPr>
+        <w:t>로 탐지하였다. 금융 29개와 AWS 지원문서 144개에서는 탐지가 없었다. 의료 일반교육에서 질환·처방 용어가 등장했다는 사실만으로 개인의 건강정보라고 판정한 결과는 값의 존재와 개인 귀속을 구분하지 못하는 현재 사전·패턴 구조의 취약점을 보여준다.</w:t>
+      </w:r>
+    </w:p>
+    <w:p>
+      <w:pPr>
+        <w:widowControl/>
+        <w:spacing w:before="0" w:after="60" w:line="331" w:lineRule="auto"/>
+        <w:ind w:firstLine="397"/>
+        <w:jc w:val="both"/>
+      </w:pPr>
+      <w:r>
+        <w:rPr>
+          <w:rFonts w:ascii="바탕" w:hAnsi="바탕" w:eastAsia="바탕"/>
+          <w:color w:val="000000"/>
+          <w:sz w:val="19"/>
+        </w:rPr>
+        <w:t>합성 정상문장 생성기는 직접적인 PII 유사패턴을 의도적으로 피하므로 0%는 회귀검사 결과일 뿐이다. 반대로 4건 fixture의 25%는 분모가 너무 작다. 법령 1.91%와 서비스 문서 6.93%는 실제 공개문서에서 어휘적 과잉차단이 존재하고 도메인별 차이가 크다는 증거지만, 확률표본이 아니고 48건의 2인 독립 판정도 끝나지 않았으므로 실서비스 오탐률로 일반화할 수 없다. 네 결과를 함께 보면 Layer 0의 추가 차단 효과와 키워드 탐지의 문맥 한계를 동시에 보고해야 한다.</w:t>
       </w:r>
     </w:p>
     <w:p>
@@ -7874,7 +8137,7 @@
           <w:color w:val="000000"/>
           <w:sz w:val="19"/>
         </w:rPr>
-        <w:t>다만 Layer 0는 독립된 완전방어가 아니다. 새 평가에서도 C 구성의 미차단은 706건이었다. 또한 합성 정상문장 10,000건에서는 오탐이 없었지만, 공식 법령 조문 1,519개 중 29개(1.91%)에서 “대한민국”과 “연구소” 같은 비식별 어휘가 국적·부서로 탐지되었다. 사전·패턴 기반 탐지는 새로운 표현과 문맥을 놓칠 뿐 아니라 일반 문장을 과잉차단할 수 있다. 따라서 Layer 0는 후속 계층과 문맥 점수·allowlist·감사 절차를 결합하는 “필요하지만 충분하지 않은” 입력 통제로 규정해야 한다.</w:t>
+        <w:t>다만 Layer 0는 독립된 완전방어가 아니다. 새 평가에서도 C 구성의 미차단은 706건이었다. 합성 정상문장 10,000건에서는 오탐이 없었지만, 공식 법령 1,519개 중 29개(1.91%), 서비스 도메인 공식 문서 693개 중 48개(6.93%)가 과잉차단 후보로 탐지되었다. 특히 의료 일반교육은 16.60%가 탐지되어 사전·패턴 기반 탐지가 개인 귀속 문맥을 구분하지 못할 때 가용성을 크게 해칠 수 있음을 보여준다. 따라서 Layer 0는 후속 계층과 문맥 점수·allowlist·감사 절차를 결합하는 “필요하지만 충분하지 않은” 입력 통제로 규정해야 한다.</w:t>
       </w:r>
     </w:p>
     <w:p>
@@ -8583,7 +8846,7 @@
           <w:color w:val="000000"/>
           <w:sz w:val="19"/>
         </w:rPr>
-        <w:t>논문은 탐지율뿐 아니라 효과크기와 95% 신뢰구간, 카테고리별 분모, 오류·타임아웃, 불확실 사례 수를 보고해야 한다. 본 연구의 법령 조문 감사처럼 재배포·출처 추적이 가능한 실제 비민감 한국어 문장으로 오탐을 확인하되, 한 도메인의 어휘분포를 일반화하지 않도록 의료·금융·상담·개발문서 등으로 외부검증 도메인을 확장해야 한다.</w:t>
+        <w:t>논문은 탐지율뿐 아니라 효과크기와 95% 신뢰구간, 카테고리별 분모, 오류·타임아웃, 불확실 사례 수를 보고해야 한다. 본 연구처럼 재배포·출처 추적이 가능한 실제 비민감 한국어 문장으로 오탐을 확인하고, 법령·의료·금융·지원·개발문서의 결과를 분리해 보고해야 한다. 후속 연구는 이번 목적표본을 고객문의·상담·전자상거래·사내 지식문서 등 개인정보를 제거한 운영 유사 자료로 확장하고, 도메인별 표본설계와 사람 이중라벨을 사전에 고정해야 한다.</w:t>
       </w:r>
     </w:p>
     <w:p>
@@ -8983,7 +9246,7 @@
           <w:color w:val="000000"/>
           <w:sz w:val="19"/>
         </w:rPr>
-        <w:t>셋째, 공개 법령 조문 1,519개를 추가하여 합성 정상 한국어의 약점을 일부 보완했지만, 법률문서만으로 의료·금융·상담 도메인의 어휘와 PII 유사 형식을 대표할 수 없다. 29개 탐지 사례는 자동 규칙과 단일 연구자의 문맥 판정에 따른 과잉차단 후보이며 독립 검토자 2인의 이중 라벨을 거치지 않았다. 따라서 1.91%를 실서비스 오탐률로 해석할 수 없고, 서비스 도메인의 자연발생 hard negative가 여전히 필요하다.</w:t>
+        <w:t>셋째, 공개 법령 1,519개와 네 서비스 도메인의 공식 문서 693개를 추가하여 합성 정상 한국어의 약점을 보완했지만, 모두 공개 목적표본이며 실제 고객문의·상담·내부문서의 분포를 대표하지 않는다. 법령 29개와 서비스 문서 48개 탐지 사례는 자동 규칙에 따른 과잉차단 후보이며 독립 검토자 2인의 이중 라벨을 거치지 않았다. 특히 금융 표본은 29개로 작다. 따라서 1.91%나 6.93%를 실서비스 오탐률로 해석할 수 없고, 운영 유사 자료의 사전등록 표본과 독립 이중라벨이 추가로 필요하다.</w:t>
       </w:r>
     </w:p>
     <w:p>
@@ -9095,7 +9358,7 @@
           <w:color w:val="000000"/>
           <w:sz w:val="19"/>
         </w:rPr>
-        <w:t>였다. 반대 방향 사례는 없었다. 따라서 한국어 생성형 AI 서비스에는 변형을 후속 계층 이전에 정규화하고 한국어 패턴을 검사하는 Layer 0가 필수 심층방어 계층으로 필요하다. 그러나 706건의 잔존 미차단과 공식 법령 조문 29건의 과잉차단 후보는 Layer 0가 충분조건이 아니며 문맥 기반 완화와 후속 검증이 필요함을 동시에 보여준다.</w:t>
+        <w:t>였다. 반대 방향 사례는 없었다. 따라서 한국어 생성형 AI 서비스에는 변형을 후속 계층 이전에 정규화하고 한국어 패턴을 검사하는 Layer 0가 필수 심층방어 계층으로 필요하다. 그러나 706건의 잔존 미차단, 법령 29건과 서비스 문서 48건의 과잉차단 후보는 Layer 0가 충분조건이 아니며 개인 귀속 문맥을 확인하는 완화와 후속 검증이 필요함을 동시에 보여준다.</w:t>
       </w:r>
     </w:p>
     <w:p>
@@ -9111,7 +9374,7 @@
           <w:color w:val="000000"/>
           <w:sz w:val="19"/>
         </w:rPr>
-        <w:t>정책적 결론은 두 층위로 정리할 수 있다. 첫째, 현재 저장 실험에서는 변형된 한국어 PII의 기술적 유출 가능성이 증가하고 Layer 0가 이를 실질적으로 줄였으므로, 조직은 Layer 0와 동등한 입력 정규화·차단 기능을 배치하고 그 효과를 입증해야 한다. 둘째, 그 효과를 실제 서비스와 법적 준수에 일반화하려면 변이 후 gold span·단일 평가기·복수 도메인 hard negative·사람 검토·버전 공개·깨끗한 환경 재현을 갖추고 과잉차단도 함께 통제해야 한다. 형사정책은 특정 제품의 단일 점수를 처벌기준으로 삼기보다 보호조치의 실효성과 비례성을 독립적으로 입증하도록 하는 절차와 감사가능성을 제도화해야 한다.</w:t>
+        <w:t>정책적 결론은 두 층위로 정리할 수 있다. 첫째, 현재 저장 실험에서는 변형된 한국어 PII의 기술적 유출 가능성이 증가하고 Layer 0가 이를 실질적으로 줄였으므로, 조직은 Layer 0와 동등한 입력 정규화·차단 기능을 배치하고 그 효과를 입증해야 한다. 둘째, 그 효과를 실제 서비스와 법적 준수에 일반화하려면 변이 후 gold span·단일 평가기·복수 도메인 hard negative·사람 이중검토·버전 공개·깨끗한 환경 재현을 갖추고 과잉차단도 함께 통제해야 한다. 형사정책은 특정 제품의 단일 점수를 처벌기준으로 삼기보다 보호조치의 실효성과 비례성을 독립적으로 입증하도록 하는 절차와 감사가능성을 제도화해야 한다.</w:t>
       </w:r>
     </w:p>
     <w:p>
@@ -9897,7 +10160,7 @@
           <w:color w:val="000000"/>
           <w:sz w:val="19"/>
         </w:rPr>
-        <w:t>A/B/C/D 수치는 같은 저장 산출물에 새 평가기를 적용한 감사 결과다. 당시 제품 설정을 복원한 전향적 재실행이나 현재 제품의 보편적 순위를 뜻하지 않는다. 법령 조문 감사는 실제 공개문서에서 어휘적 과잉차단이 발생함을 확인했지만 서비스 도메인을 대표하지 않는다. 제품 선택이나 규제기준에 사용하려면 자동 복원 표본과 hard negative의 독립 사람 검토, 복수 서비스 도메인 외부검증, 설정을 고정한 재실험이 추가되어야 한다.</w:t>
+        <w:t>A/B/C/D 수치는 같은 저장 산출물에 새 평가기를 적용한 감사 결과다. 당시 제품 설정을 복원한 전향적 재실행이나 현재 제품의 보편적 순위를 뜻하지 않는다. 법령·의료·금융·지원·개발문서 감사는 실제 공개문서에서 도메인별 어휘적 과잉차단 차이를 확인했지만 운영 트래픽을 대표하지 않는다. 제품 선택이나 규제기준에 사용하려면 자동 복원 표본과 77개 과잉차단 후보의 독립 사람 검토, 운영 유사 자료의 외부검증, 설정을 고정한 재실험이 추가되어야 한다.</w:t>
       </w:r>
     </w:p>
     <w:sectPr>

</xml_diff>

<commit_message>
docs: add repository scope and reviewer evidence
</commit_message>
<xml_diff>
--- a/paper/범죄와정책_투고원고_검증본.docx
+++ b/paper/범죄와정책_투고원고_검증본.docx
@@ -156,7 +156,7 @@
           <w:color w:val="000000"/>
           <w:sz w:val="20"/>
         </w:rPr>
-        <w:t>생성형 인공지능 서비스의 한국어 개인식별정보(PII)는 문자·인코딩·표기 변형으로 기존 가드레일을 우회할 수 있다. 본 연구는 관련 4개 저장소와 109개 원격 참조, 10,000건의 합성 페이로드 및 네 방어구성의 저장 결과를 감사하였다. 변이 후 보호대상을 9,964건(99.64%)에서 복원한 결과 기존 3계층의 미차단은 2,060건(20.67%), Layer 0 추가 구성은 706건(7.09%)이었다. 동일 원천값의 한국어 2,305쌍에서 기존 계층의 미차단율은 원형 24.47%에서 변이 32.28%로 증가했고, 원천 그룹 동일가중 위험차는 6.86%p(95% 군집 부트스트랩 4.06~9.69)였다. 보호대상 값이 변한 쌍에서 증가가 집중되었으며, Layer 0는 기존 계층이 놓친 1,354건을 추가 차단하였다. 한편 공식 법령 1,519개 중 29개와 의료·금융·지원·개발 문서 693개 중 48개가 과잉차단 후보로 탐지되어 문맥 한계도 확인되었다. 따라서 Layer 0는 변형 PII를 후속 계층 이전에 정규화·차단하는 필수 입력 통제이지만 충분조건은 아니다. 정책 활용에는 변이 후 정답, 단일 평가기, 사람 이중검토, 설정·버전 공개와 운영 유사 자료의 외부검증이 필요하며, 결과를 범죄율이나 법적 준수율로 일반화해서는 안 된다.</w:t>
+        <w:t>생성형 인공지능 서비스의 한국어 개인식별정보(PII)는 문자·인코딩·표기 변형으로 기존 가드레일을 우회할 수 있다. 본 연구는 관련 4개 저장소와 110개 원격 참조, 10,000건의 합성 페이로드 및 네 방어구성의 저장 결과를 감사하였다. 변이 후 보호대상을 9,964건(99.64%)에서 복원한 결과 기존 3계층의 미차단은 2,060건(20.67%), Layer 0 추가 구성은 706건(7.09%)이었다. 동일 원천값의 한국어 2,305쌍에서 기존 계층의 미차단율은 원형 24.47%에서 변이 32.28%로 증가했고, 원천 그룹 동일가중 위험차는 6.86%p(95% 군집 부트스트랩 4.06~9.69)였다. 보호대상 값이 변한 쌍에서 증가가 집중되었으며, Layer 0는 기존 계층이 놓친 1,354건을 추가 차단하였다. 한편 공식 법령 1,519개 중 29개와 의료·금융·지원·개발 문서 693개 중 48개가 과잉차단 후보로 탐지되어 문맥 한계도 확인되었다. 따라서 Layer 0는 변형 PII를 후속 계층 이전에 정규화·차단하는 필수 입력 통제이지만 충분조건은 아니다. 정책 활용에는 변이 후 정답, 단일 평가기, 사람 이중검토, 설정·버전 공개와 운영 유사 자료의 외부검증이 필요하며, 결과를 범죄율이나 법적 준수율로 일반화해서는 안 된다.</w:t>
       </w:r>
     </w:p>
     <w:p>
@@ -1582,7 +1582,23 @@
           <w:color w:val="000000"/>
           <w:sz w:val="20"/>
         </w:rPr>
-        <w:t xml:space="preserve"> 원격의 109개 ref를 파일명과 핵심 증거를 기준으로 검색하였다. 공개 저장소에서는 39개 원격 브랜치를 별도로 확인하였다. 최신 논문 설계는 내부 저장소의 v2였고, 저장된 실험 결과의 기준은 공개 저장소 main이었다.</w:t>
+        <w:t xml:space="preserve"> 원격의 110개 ref(활성 브랜치 42개, 보존 PR head 68개)를 파일명과 핵심 증거를 기준으로 검색하였다. 두 참조 유형에는 같은 커밋이 중복될 수 있다. 공개 저장소에서는 39개 원격 브랜치를 별도로 확인하였다. 최신 논문 설계는 내부 저장소의 v2였고, 저장된 실험 결과의 기준은 공개 저장소 main이었다. 2026년 7월 26일 추가된 PR #88은 GitHub Actions의 </w:t>
+      </w:r>
+      <w:r>
+        <w:rPr>
+          <w:rFonts w:ascii="Consolas" w:hAnsi="Consolas" w:eastAsia="Consolas"/>
+          <w:color w:val="000000"/>
+          <w:sz w:val="19"/>
+        </w:rPr>
+        <w:t>setup-python</w:t>
+      </w:r>
+      <w:r>
+        <w:rPr>
+          <w:rFonts w:ascii="HY신명조" w:hAnsi="HY신명조" w:eastAsia="HY신명조"/>
+          <w:color w:val="000000"/>
+          <w:sz w:val="20"/>
+        </w:rPr>
+        <w:t xml:space="preserve"> 버전 한 줄만 바꾸므로 논문 데이터·코드·주장 기준선에는 영향을 주지 않았다.</w:t>
       </w:r>
     </w:p>
     <w:p>
@@ -7491,7 +7507,7 @@
           <w:color w:val="000000"/>
           <w:sz w:val="20"/>
         </w:rPr>
-        <w:t xml:space="preserve">두 파일은 확인한 4개 저장소와 109개 원격 ref 어디에도 없었다. fuzzer는 기본 정책에서 파일이 없으면 </w:t>
+        <w:t xml:space="preserve">두 파일은 확인한 4개 저장소와 110개 원격 ref 어디에도 없었다. fuzzer는 기본 정책에서 파일이 없으면 </w:t>
       </w:r>
       <w:r>
         <w:rPr>
@@ -10613,7 +10629,7 @@
           <w:color w:val="000000"/>
           <w:sz w:val="20"/>
         </w:rPr>
-        <w:t>Korean personally identifiable information (PII) can bypass generative-AI guardrails through character, encoding, and notation changes. This study audits four related repositories, 109 remote references, 10,000 synthetic payloads, and stored outputs from four defense configurations. It reconstructs the post-mutation protected value in 9,964 cases (99.64%). The existing three-layer stack left 2,060 cases unblocked (20.67%), whereas the configuration with Layer 0 left 706 (7.09%). Among 2,305 matched Korean pairs sharing the same PII type and source value, the baseline unblocked rate increased from 24.47% for original cases to 32.28% for mutations. Layer 0 additionally blocked 1,354 cases missed by the baseline. A counter-audit found 29 candidates among 1,519 public-law units and 48 among 693 official medical, finance, support, and developer units, demonstrating context-dependent overblocking. Layer 0 is therefore necessary as an input control that normalizes and screens transformed Korean PII before later layers, but it is not sufficient by itself. Policy use requires post-mutation gold values, a single evaluator, independent human review, disclosed settings and versions, and external validation with operation-like data.</w:t>
+        <w:t>Korean personally identifiable information (PII) can bypass generative-AI guardrails through character, encoding, and notation changes. This study audits four related repositories, 110 remote references, 10,000 synthetic payloads, and stored outputs from four defense configurations. It reconstructs the post-mutation protected value in 9,964 cases (99.64%). The existing three-layer stack left 2,060 cases unblocked (20.67%), whereas the configuration with Layer 0 left 706 (7.09%). Among 2,305 matched Korean pairs sharing the same PII type and source value, the baseline unblocked rate increased from 24.47% for original cases to 32.28% for mutations. Layer 0 additionally blocked 1,354 cases missed by the baseline. A counter-audit found 29 candidates among 1,519 public-law units and 48 among 693 official medical, finance, support, and developer units, demonstrating context-dependent overblocking. Layer 0 is therefore necessary as an input control that normalizes and screens transformed Korean PII before later layers, but it is not sufficient by itself. Policy use requires post-mutation gold values, a single evaluator, independent human review, disclosed settings and versions, and external validation with operation-like data.</w:t>
       </w:r>
     </w:p>
     <w:p>

</xml_diff>

<commit_message>
docs: freeze verified paper evidence version
</commit_message>
<xml_diff>
--- a/paper/범죄와정책_투고원고_검증본.docx
+++ b/paper/범죄와정책_투고원고_검증본.docx
@@ -87,7 +87,7 @@
           <w:color w:val="5A5A5A"/>
           <w:sz w:val="17"/>
         </w:rPr>
-        <w:t>원고 작성 기준일: 2026년 7월 26일</w:t>
+        <w:t>원고 작성·최종 자동검증 기준일: 2026년 7월 27일</w:t>
       </w:r>
     </w:p>
     <w:p>
@@ -125,7 +125,7 @@
           <w:color w:val="5A5A5A"/>
           <w:sz w:val="16"/>
         </w:rPr>
-        <w:t>694ca71</w:t>
+        <w:t>694ca717dd47e3d8f229bfa4da84c1fad607576b</w:t>
       </w:r>
     </w:p>
     <w:p>
@@ -1114,9 +1114,9 @@
         </w:tblBorders>
       </w:tblPr>
       <w:tblGrid>
-        <w:gridCol w:w="3962"/>
-        <w:gridCol w:w="2185"/>
-        <w:gridCol w:w="3823"/>
+        <w:gridCol w:w="3815"/>
+        <w:gridCol w:w="2472"/>
+        <w:gridCol w:w="3683"/>
       </w:tblGrid>
       <w:tr>
         <w:trPr>
@@ -1125,7 +1125,7 @@
         </w:trPr>
         <w:tc>
           <w:tcPr>
-            <w:tcW w:type="dxa" w:w="3962"/>
+            <w:tcW w:type="dxa" w:w="3815"/>
             <w:vAlign w:val="center"/>
             <w:shd w:fill="E7E7E7"/>
             <w:tcMar>
@@ -1153,7 +1153,7 @@
         </w:tc>
         <w:tc>
           <w:tcPr>
-            <w:tcW w:type="dxa" w:w="2185"/>
+            <w:tcW w:type="dxa" w:w="2472"/>
             <w:vAlign w:val="center"/>
             <w:shd w:fill="E7E7E7"/>
             <w:tcMar>
@@ -1181,7 +1181,7 @@
         </w:tc>
         <w:tc>
           <w:tcPr>
-            <w:tcW w:type="dxa" w:w="3823"/>
+            <w:tcW w:type="dxa" w:w="3683"/>
             <w:vAlign w:val="center"/>
             <w:shd w:fill="E7E7E7"/>
             <w:tcMar>
@@ -1214,7 +1214,7 @@
         </w:trPr>
         <w:tc>
           <w:tcPr>
-            <w:tcW w:type="dxa" w:w="3962"/>
+            <w:tcW w:type="dxa" w:w="3815"/>
             <w:vAlign w:val="center"/>
             <w:tcMar>
               <w:top w:w="70" w:type="dxa"/>
@@ -1240,7 +1240,7 @@
         </w:tc>
         <w:tc>
           <w:tcPr>
-            <w:tcW w:type="dxa" w:w="2185"/>
+            <w:tcW w:type="dxa" w:w="2472"/>
             <w:vAlign w:val="center"/>
             <w:tcMar>
               <w:top w:w="70" w:type="dxa"/>
@@ -1260,13 +1260,13 @@
                 <w:color w:val="000000"/>
                 <w:sz w:val="16"/>
               </w:rPr>
-              <w:t>694ca71</w:t>
+              <w:t>694ca717dd47</w:t>
             </w:r>
           </w:p>
         </w:tc>
         <w:tc>
           <w:tcPr>
-            <w:tcW w:type="dxa" w:w="3823"/>
+            <w:tcW w:type="dxa" w:w="3683"/>
             <w:vAlign w:val="center"/>
             <w:tcMar>
               <w:top w:w="70" w:type="dxa"/>
@@ -1297,7 +1297,7 @@
         </w:trPr>
         <w:tc>
           <w:tcPr>
-            <w:tcW w:type="dxa" w:w="3962"/>
+            <w:tcW w:type="dxa" w:w="3815"/>
             <w:vAlign w:val="center"/>
             <w:tcMar>
               <w:top w:w="70" w:type="dxa"/>
@@ -1323,7 +1323,7 @@
         </w:tc>
         <w:tc>
           <w:tcPr>
-            <w:tcW w:type="dxa" w:w="2185"/>
+            <w:tcW w:type="dxa" w:w="2472"/>
             <w:vAlign w:val="center"/>
             <w:tcMar>
               <w:top w:w="70" w:type="dxa"/>
@@ -1343,13 +1343,13 @@
                 <w:color w:val="000000"/>
                 <w:sz w:val="16"/>
               </w:rPr>
-              <w:t>6e9c6be</w:t>
+              <w:t>6e9c6beef29d</w:t>
             </w:r>
           </w:p>
         </w:tc>
         <w:tc>
           <w:tcPr>
-            <w:tcW w:type="dxa" w:w="3823"/>
+            <w:tcW w:type="dxa" w:w="3683"/>
             <w:vAlign w:val="center"/>
             <w:tcMar>
               <w:top w:w="70" w:type="dxa"/>
@@ -1380,7 +1380,7 @@
         </w:trPr>
         <w:tc>
           <w:tcPr>
-            <w:tcW w:type="dxa" w:w="3962"/>
+            <w:tcW w:type="dxa" w:w="3815"/>
             <w:vAlign w:val="center"/>
             <w:tcMar>
               <w:top w:w="70" w:type="dxa"/>
@@ -1406,7 +1406,7 @@
         </w:tc>
         <w:tc>
           <w:tcPr>
-            <w:tcW w:type="dxa" w:w="2185"/>
+            <w:tcW w:type="dxa" w:w="2472"/>
             <w:vAlign w:val="center"/>
             <w:tcMar>
               <w:top w:w="70" w:type="dxa"/>
@@ -1426,13 +1426,13 @@
                 <w:color w:val="000000"/>
                 <w:sz w:val="16"/>
               </w:rPr>
-              <w:t>cc6288d</w:t>
+              <w:t>cc6288d0d868</w:t>
             </w:r>
           </w:p>
         </w:tc>
         <w:tc>
           <w:tcPr>
-            <w:tcW w:type="dxa" w:w="3823"/>
+            <w:tcW w:type="dxa" w:w="3683"/>
             <w:vAlign w:val="center"/>
             <w:tcMar>
               <w:top w:w="70" w:type="dxa"/>
@@ -1463,7 +1463,7 @@
         </w:trPr>
         <w:tc>
           <w:tcPr>
-            <w:tcW w:type="dxa" w:w="3962"/>
+            <w:tcW w:type="dxa" w:w="3815"/>
             <w:vAlign w:val="center"/>
             <w:tcMar>
               <w:top w:w="70" w:type="dxa"/>
@@ -1489,7 +1489,7 @@
         </w:tc>
         <w:tc>
           <w:tcPr>
-            <w:tcW w:type="dxa" w:w="2185"/>
+            <w:tcW w:type="dxa" w:w="2472"/>
             <w:vAlign w:val="center"/>
             <w:tcMar>
               <w:top w:w="70" w:type="dxa"/>
@@ -1509,13 +1509,13 @@
                 <w:color w:val="000000"/>
                 <w:sz w:val="16"/>
               </w:rPr>
-              <w:t>72f8eb1</w:t>
+              <w:t>72f8eb17a38c</w:t>
             </w:r>
           </w:p>
         </w:tc>
         <w:tc>
           <w:tcPr>
-            <w:tcW w:type="dxa" w:w="3823"/>
+            <w:tcW w:type="dxa" w:w="3683"/>
             <w:vAlign w:val="center"/>
             <w:tcMar>
               <w:top w:w="70" w:type="dxa"/>

</xml_diff>

<commit_message>
docs: align Korean and English paper abstracts
</commit_message>
<xml_diff>
--- a/paper/범죄와정책_투고원고_검증본.docx
+++ b/paper/범죄와정책_투고원고_검증본.docx
@@ -156,7 +156,7 @@
           <w:color w:val="000000"/>
           <w:sz w:val="20"/>
         </w:rPr>
-        <w:t>생성형 인공지능 서비스의 한국어 개인식별정보(PII)는 문자·인코딩·표기 변형으로 기존 가드레일을 우회할 수 있다. 본 연구는 관련 4개 저장소와 110개 원격 참조, 10,000건의 합성 페이로드 및 네 방어구성의 저장 결과를 감사하였다. 변이 후 보호대상을 9,964건(99.64%)에서 복원한 결과 기존 3계층의 미차단은 2,060건(20.67%), Layer 0 추가 구성은 706건(7.09%)이었다. 동일 원천값의 한국어 2,305쌍에서 기존 계층의 미차단율은 원형 24.47%에서 변이 32.28%로 증가했고, 원천 그룹 동일가중 위험차는 6.86%p(95% 군집 부트스트랩 4.06~9.69)였다. 보호대상 값이 변한 쌍에서 증가가 집중되었으며, Layer 0는 기존 계층이 놓친 1,354건을 추가 차단하였다. 한편 공식 법령 1,519개 중 29개와 의료·금융·지원·개발 문서 693개 중 48개가 과잉차단 후보로 탐지되어 문맥 한계도 확인되었다. 따라서 Layer 0는 변형 PII를 후속 계층 이전에 정규화·차단하는 필수 입력 통제이지만 충분조건은 아니다. 정책 활용에는 변이 후 정답, 단일 평가기, 사람 이중검토, 설정·버전 공개와 운영 유사 자료의 외부검증이 필요하며, 결과를 범죄율이나 법적 준수율로 일반화해서는 안 된다.</w:t>
+        <w:t>생성형 인공지능 서비스의 한국어 개인식별정보(PII)는 문자·인코딩·표기 변형으로 기존 가드레일을 우회할 수 있다. 본 연구는 관련 4개 저장소와 110개 원격 참조, 10,000건의 합성 페이로드 및 네 방어구성의 저장 결과를 감사하였다. 변이 후 보호대상을 9,964건(99.64%)에서 복원한 결과 기존 3계층의 미차단은 2,060건(20.67%), Layer 0 추가 구성은 706건(7.09%)이었다. 동일 원천값의 한국어 2,305쌍에서 기존 계층의 미차단율은 원형 24.47%에서 변이 32.28%로 증가했고, 원천 그룹 동일가중 위험차는 6.86%p(95% 군집 부트스트랩 4.06~9.69)였다. 증가는 보호대상 값이 변한 쌍에 집중되었고, 표면형을 보존한 문맥 변형에서는 증가가 입증되지 않았다. Layer 0는 기존 계층이 놓친 1,354건을 추가 차단하였다. 한편 공식 법령 1,519개 중 29개와 의료·금융·지원·개발 문서 693개 중 48개가 과잉차단 후보로 탐지되어 문맥 한계도 확인되었다. 따라서 Layer 0는 변형 PII를 후속 계층 이전에 정규화·차단하는 필수 입력 통제이지만 충분조건은 아니다. 정책 활용에는 변이 후 정답, 단일 평가기, 사람 이중검토, 설정·버전 공개와 운영 유사 자료의 외부검증이 필요하며, 결과를 범죄율이나 법적 준수율로 일반화해서는 안 된다.</w:t>
       </w:r>
     </w:p>
     <w:p>
@@ -10629,7 +10629,7 @@
           <w:color w:val="000000"/>
           <w:sz w:val="20"/>
         </w:rPr>
-        <w:t>Korean personally identifiable information (PII) can bypass generative-AI guardrails through character, encoding, and notation changes. This study audits four related repositories, 110 remote references, 10,000 synthetic payloads, and stored outputs from four defense configurations. It reconstructs the post-mutation protected value in 9,964 cases (99.64%). The existing three-layer stack left 2,060 cases unblocked (20.67%), whereas the configuration with Layer 0 left 706 (7.09%). Among 2,305 matched Korean pairs sharing the same PII type and source value, the baseline unblocked rate increased from 24.47% for original cases to 32.28% for mutations. Layer 0 additionally blocked 1,354 cases missed by the baseline. A counter-audit found 29 candidates among 1,519 public-law units and 48 among 693 official medical, finance, support, and developer units, demonstrating context-dependent overblocking. Layer 0 is therefore necessary as an input control that normalizes and screens transformed Korean PII before later layers, but it is not sufficient by itself. Policy use requires post-mutation gold values, a single evaluator, independent human review, disclosed settings and versions, and external validation with operation-like data.</w:t>
+        <w:t>Korean personally identifiable information (PII) can bypass generative-AI guardrails through character, encoding, and notation changes. This study audits four related repositories, 110 remote references, 10,000 synthetic payloads, and stored outputs from four defense configurations. It reconstructs the post-mutation protected value in 9,964 cases (99.64%). The existing three-layer stack left 2,060 cases unblocked (20.67%), whereas the configuration with Layer 0 left 706 (7.09%). Among 2,305 matched Korean pairs sharing the same PII type and source value, the baseline unblocked rate increased from 24.47% for original cases to 32.28% for mutations. The source-group equally weighted risk difference was 6.86 percentage points (95% cluster-bootstrap CI: 4.06-9.69). The increase was concentrated in target-changing transformations; no increase was demonstrated for target-preserving context changes. Layer 0 additionally blocked 1,354 cases missed by the baseline. A counter-audit found 29 candidates among 1,519 public-law units and 48 among 693 official medical, finance, support, and developer units, demonstrating context-dependent overblocking. Layer 0 is therefore necessary as an input control that normalizes and screens transformed Korean PII before later layers, but it is not sufficient by itself. Policy use requires post-mutation gold values, a single evaluator, independent human review, disclosed settings and versions, and external validation with operationally realistic data.</w:t>
       </w:r>
     </w:p>
     <w:p>

</xml_diff>